<commit_message>
Publish June 5 investor update and platform article
</commit_message>
<xml_diff>
--- a/public/investor-downloads/daily-brief-2026-06-05.docx
+++ b/public/investor-downloads/daily-brief-2026-06-05.docx
@@ -8,7 +8,7 @@
       </w:pPr>
       <w:r>
         <w:rPr>
-          <w:rFonts w:ascii="Calibri" w:hAnsi="Calibri" w:eastAsia="Heiti TC"/>
+          <w:rFonts w:ascii="Calibri" w:hAnsi="Calibri" w:eastAsia="Songti SC"/>
           <w:b/>
           <w:i w:val="0"/>
           <w:color w:val="285B9D"/>
@@ -24,7 +24,7 @@
       </w:pPr>
       <w:r>
         <w:rPr>
-          <w:rFonts w:ascii="Calibri" w:hAnsi="Calibri" w:eastAsia="Heiti TC"/>
+          <w:rFonts w:ascii="Calibri" w:hAnsi="Calibri" w:eastAsia="Songti SC"/>
           <w:b w:val="0"/>
           <w:i w:val="0"/>
         </w:rPr>
@@ -38,7 +38,7 @@
       </w:pPr>
       <w:r>
         <w:rPr>
-          <w:rFonts w:ascii="Calibri" w:hAnsi="Calibri" w:eastAsia="Heiti TC"/>
+          <w:rFonts w:ascii="Calibri" w:hAnsi="Calibri" w:eastAsia="Songti SC"/>
           <w:b w:val="0"/>
           <w:i w:val="0"/>
         </w:rPr>
@@ -51,7 +51,7 @@
       </w:pPr>
       <w:r>
         <w:rPr>
-          <w:rFonts w:ascii="Calibri" w:hAnsi="Calibri" w:eastAsia="Heiti TC"/>
+          <w:rFonts w:ascii="Calibri" w:hAnsi="Calibri" w:eastAsia="Songti SC"/>
           <w:b/>
           <w:i w:val="0"/>
           <w:color w:val="0B2545"/>
@@ -66,13 +66,13 @@
       </w:pPr>
       <w:r>
         <w:rPr>
-          <w:rFonts w:ascii="Calibri" w:hAnsi="Calibri" w:eastAsia="Heiti TC"/>
+          <w:rFonts w:ascii="Calibri" w:hAnsi="Calibri" w:eastAsia="Songti SC"/>
           <w:b w:val="0"/>
           <w:i w:val="0"/>
           <w:color w:val="334155"/>
           <w:sz w:val="22"/>
         </w:rPr>
-        <w:t>2026-06-05 共纳入 1 篇中文研究结果，覆盖 0 位活跃分析师和 2 条主要行业链，较 2026-06-04 的主题变化可在右侧动量表中核对。简报优先呈现可被报告链接追溯的结论，而不是孤立摘要。</w:t>
+        <w:t>2026-06-05 共纳入 142 篇中文研究结果，覆盖 25 位活跃分析师和 6 条主要行业链，较 2026-06-04 的主题变化可在右侧动量表中核对。简报优先呈现可被报告链接追溯的结论，而不是孤立摘要。</w:t>
       </w:r>
     </w:p>
     <w:tbl>
@@ -101,7 +101,7 @@
             </w:pPr>
             <w:r>
               <w:rPr>
-                <w:rFonts w:ascii="Calibri" w:hAnsi="Calibri" w:eastAsia="Heiti TC"/>
+                <w:rFonts w:ascii="Calibri" w:hAnsi="Calibri" w:eastAsia="Songti SC"/>
                 <w:b/>
                 <w:color w:val="667085"/>
                 <w:sz w:val="17"/>
@@ -111,12 +111,12 @@
             </w:r>
             <w:r>
               <w:rPr>
-                <w:rFonts w:ascii="Calibri" w:hAnsi="Calibri" w:eastAsia="Heiti TC"/>
+                <w:rFonts w:ascii="Calibri" w:hAnsi="Calibri" w:eastAsia="Songti SC"/>
                 <w:b/>
                 <w:color w:val="285B9D"/>
                 <w:sz w:val="36"/>
               </w:rPr>
-              <w:t>1</w:t>
+              <w:t>142</w:t>
             </w:r>
           </w:p>
         </w:tc>
@@ -132,7 +132,7 @@
             </w:pPr>
             <w:r>
               <w:rPr>
-                <w:rFonts w:ascii="Calibri" w:hAnsi="Calibri" w:eastAsia="Heiti TC"/>
+                <w:rFonts w:ascii="Calibri" w:hAnsi="Calibri" w:eastAsia="Songti SC"/>
                 <w:b/>
                 <w:color w:val="667085"/>
                 <w:sz w:val="17"/>
@@ -142,12 +142,12 @@
             </w:r>
             <w:r>
               <w:rPr>
-                <w:rFonts w:ascii="Calibri" w:hAnsi="Calibri" w:eastAsia="Heiti TC"/>
+                <w:rFonts w:ascii="Calibri" w:hAnsi="Calibri" w:eastAsia="Songti SC"/>
                 <w:b/>
                 <w:color w:val="237A5B"/>
                 <w:sz w:val="36"/>
               </w:rPr>
-              <w:t>0</w:t>
+              <w:t>25</w:t>
             </w:r>
           </w:p>
         </w:tc>
@@ -163,7 +163,7 @@
             </w:pPr>
             <w:r>
               <w:rPr>
-                <w:rFonts w:ascii="Calibri" w:hAnsi="Calibri" w:eastAsia="Heiti TC"/>
+                <w:rFonts w:ascii="Calibri" w:hAnsi="Calibri" w:eastAsia="Songti SC"/>
                 <w:b/>
                 <w:color w:val="667085"/>
                 <w:sz w:val="17"/>
@@ -173,12 +173,12 @@
             </w:r>
             <w:r>
               <w:rPr>
-                <w:rFonts w:ascii="Calibri" w:hAnsi="Calibri" w:eastAsia="Heiti TC"/>
+                <w:rFonts w:ascii="Calibri" w:hAnsi="Calibri" w:eastAsia="Songti SC"/>
                 <w:b/>
                 <w:color w:val="A8731B"/>
                 <w:sz w:val="36"/>
               </w:rPr>
-              <w:t>2</w:t>
+              <w:t>6</w:t>
             </w:r>
           </w:p>
         </w:tc>
@@ -194,7 +194,7 @@
             </w:pPr>
             <w:r>
               <w:rPr>
-                <w:rFonts w:ascii="Calibri" w:hAnsi="Calibri" w:eastAsia="Heiti TC"/>
+                <w:rFonts w:ascii="Calibri" w:hAnsi="Calibri" w:eastAsia="Songti SC"/>
                 <w:b/>
                 <w:color w:val="667085"/>
                 <w:sz w:val="17"/>
@@ -204,7 +204,7 @@
             </w:r>
             <w:r>
               <w:rPr>
-                <w:rFonts w:ascii="Calibri" w:hAnsi="Calibri" w:eastAsia="Heiti TC"/>
+                <w:rFonts w:ascii="Calibri" w:hAnsi="Calibri" w:eastAsia="Songti SC"/>
                 <w:b/>
                 <w:color w:val="B43D49"/>
                 <w:sz w:val="36"/>
@@ -268,7 +268,7 @@
       </w:pPr>
       <w:r>
         <w:rPr>
-          <w:rFonts w:ascii="Calibri" w:hAnsi="Calibri" w:eastAsia="Heiti TC"/>
+          <w:rFonts w:ascii="Calibri" w:hAnsi="Calibri" w:eastAsia="Songti SC"/>
           <w:b w:val="0"/>
           <w:i/>
           <w:color w:val="667085"/>
@@ -292,7 +292,7 @@
       </w:pPr>
       <w:r>
         <w:rPr>
-          <w:rFonts w:ascii="Calibri" w:hAnsi="Calibri" w:eastAsia="Heiti TC"/>
+          <w:rFonts w:ascii="Calibri" w:hAnsi="Calibri" w:eastAsia="Songti SC"/>
           <w:b/>
           <w:color w:val="285B9D"/>
           <w:sz w:val="21"/>
@@ -304,9 +304,9 @@
           <w:rPr>
             <w:color w:val="285B9D"/>
             <w:u w:val="single"/>
-            <w:rFonts w:eastAsia="Heiti TC" w:ascii="Calibri" w:hAnsi="Calibri"/>
+            <w:rFonts w:eastAsia="Songti SC" w:ascii="Calibri" w:hAnsi="Calibri"/>
           </w:rPr>
-          <w:t>2026-06-05 前统一事件窗口执行手册 是今日最高权重结论，核心证据来自 未识别，关联 AI 基础设施。</w:t>
+          <w:t>中游材料产能缺口对先进封装与AI算力硬件供应链的传导风险 是今日最高权重结论，核心证据来自 未识别，关联 工业供给瓶颈。</w:t>
         </w:r>
       </w:hyperlink>
     </w:p>
@@ -317,7 +317,7 @@
       </w:pPr>
       <w:r>
         <w:rPr>
-          <w:rFonts w:ascii="Calibri" w:hAnsi="Calibri" w:eastAsia="Heiti TC"/>
+          <w:rFonts w:ascii="Calibri" w:hAnsi="Calibri" w:eastAsia="Songti SC"/>
           <w:b/>
           <w:color w:val="285B9D"/>
           <w:sz w:val="21"/>
@@ -326,11 +326,11 @@
       </w:r>
       <w:r>
         <w:rPr>
-          <w:rFonts w:ascii="Calibri" w:hAnsi="Calibri" w:eastAsia="Heiti TC"/>
+          <w:rFonts w:ascii="Calibri" w:hAnsi="Calibri" w:eastAsia="Songti SC"/>
           <w:color w:val="111827"/>
           <w:sz w:val="21"/>
         </w:rPr>
-        <w:t>通胀 今日 降温，当日计数 1，前一日计数 333。</w:t>
+        <w:t>AI 今日 降温，当日计数 118，前一日计数 354。</w:t>
       </w:r>
     </w:p>
     <w:p>
@@ -340,7 +340,7 @@
       </w:pPr>
       <w:r>
         <w:rPr>
-          <w:rFonts w:ascii="Calibri" w:hAnsi="Calibri" w:eastAsia="Heiti TC"/>
+          <w:rFonts w:ascii="Calibri" w:hAnsi="Calibri" w:eastAsia="Songti SC"/>
           <w:b/>
           <w:color w:val="285B9D"/>
           <w:sz w:val="21"/>
@@ -352,7 +352,7 @@
           <w:rPr>
             <w:color w:val="285B9D"/>
             <w:u w:val="single"/>
-            <w:rFonts w:eastAsia="Heiti TC" w:ascii="Calibri" w:hAnsi="Calibri"/>
+            <w:rFonts w:eastAsia="Songti SC" w:ascii="Calibri" w:hAnsi="Calibri"/>
           </w:rPr>
           <w:t>风险矩阵最需要跟踪的是 电力与电网：算力瓶颈压力测试：电网传输与并网队列的真实时滞。</w:t>
         </w:r>
@@ -365,21 +365,21 @@
       </w:pPr>
       <w:r>
         <w:rPr>
-          <w:rFonts w:ascii="Calibri" w:hAnsi="Calibri" w:eastAsia="Heiti TC"/>
+          <w:rFonts w:ascii="Calibri" w:hAnsi="Calibri" w:eastAsia="Songti SC"/>
           <w:b/>
           <w:color w:val="285B9D"/>
           <w:sz w:val="21"/>
         </w:rPr>
         <w:t xml:space="preserve">证据密度: </w:t>
       </w:r>
-      <w:hyperlink r:id="rId12">
+      <w:hyperlink r:id="rId14">
         <w:r>
           <w:rPr>
             <w:color w:val="285B9D"/>
             <w:u w:val="single"/>
-            <w:rFonts w:eastAsia="Heiti TC" w:ascii="Calibri" w:hAnsi="Calibri"/>
+            <w:rFonts w:eastAsia="Songti SC" w:ascii="Calibri" w:hAnsi="Calibri"/>
           </w:rPr>
-          <w:t>宏观通胀传导 今日 1 条、近七日 1599 条，风险信号 1081 条。</w:t>
+          <w:t>宏观通胀传导 今日 132 条、近七日 1756 条，风险信号 1201 条。</w:t>
         </w:r>
       </w:hyperlink>
     </w:p>
@@ -403,7 +403,7 @@
           <w:p>
             <w:r>
               <w:rPr>
-                <w:rFonts w:ascii="Calibri" w:hAnsi="Calibri" w:eastAsia="Heiti TC"/>
+                <w:rFonts w:ascii="Calibri" w:hAnsi="Calibri" w:eastAsia="Songti SC"/>
                 <w:b/>
                 <w:color w:val="7A5A00"/>
                 <w:sz w:val="21"/>
@@ -412,7 +412,7 @@
             </w:r>
             <w:r>
               <w:rPr>
-                <w:rFonts w:ascii="Calibri" w:hAnsi="Calibri" w:eastAsia="Heiti TC"/>
+                <w:rFonts w:ascii="Calibri" w:hAnsi="Calibri" w:eastAsia="Songti SC"/>
                 <w:color w:val="7C2D12"/>
                 <w:sz w:val="21"/>
               </w:rPr>
@@ -456,7 +456,7 @@
                     <pic:cNvPicPr/>
                   </pic:nvPicPr>
                   <pic:blipFill>
-                    <a:blip r:embed="rId14"/>
+                    <a:blip r:embed="rId15"/>
                     <a:stretch>
                       <a:fillRect/>
                     </a:stretch>
@@ -483,7 +483,7 @@
       </w:pPr>
       <w:r>
         <w:rPr>
-          <w:rFonts w:ascii="Calibri" w:hAnsi="Calibri" w:eastAsia="Heiti TC"/>
+          <w:rFonts w:ascii="Calibri" w:hAnsi="Calibri" w:eastAsia="Songti SC"/>
           <w:b w:val="0"/>
           <w:i/>
           <w:color w:val="667085"/>
@@ -513,7 +513,7 @@
                     <pic:cNvPicPr/>
                   </pic:nvPicPr>
                   <pic:blipFill>
-                    <a:blip r:embed="rId15"/>
+                    <a:blip r:embed="rId16"/>
                     <a:stretch>
                       <a:fillRect/>
                     </a:stretch>
@@ -540,7 +540,7 @@
       </w:pPr>
       <w:r>
         <w:rPr>
-          <w:rFonts w:ascii="Calibri" w:hAnsi="Calibri" w:eastAsia="Heiti TC"/>
+          <w:rFonts w:ascii="Calibri" w:hAnsi="Calibri" w:eastAsia="Songti SC"/>
           <w:b w:val="0"/>
           <w:i/>
           <w:color w:val="667085"/>
@@ -575,7 +575,7 @@
                     <pic:cNvPicPr/>
                   </pic:nvPicPr>
                   <pic:blipFill>
-                    <a:blip r:embed="rId16"/>
+                    <a:blip r:embed="rId17"/>
                     <a:stretch>
                       <a:fillRect/>
                     </a:stretch>
@@ -602,7 +602,7 @@
       </w:pPr>
       <w:r>
         <w:rPr>
-          <w:rFonts w:ascii="Calibri" w:hAnsi="Calibri" w:eastAsia="Heiti TC"/>
+          <w:rFonts w:ascii="Calibri" w:hAnsi="Calibri" w:eastAsia="Songti SC"/>
           <w:b w:val="0"/>
           <w:i/>
           <w:color w:val="667085"/>
@@ -637,7 +637,7 @@
                     <pic:cNvPicPr/>
                   </pic:nvPicPr>
                   <pic:blipFill>
-                    <a:blip r:embed="rId17"/>
+                    <a:blip r:embed="rId18"/>
                     <a:stretch>
                       <a:fillRect/>
                     </a:stretch>
@@ -664,7 +664,7 @@
       </w:pPr>
       <w:r>
         <w:rPr>
-          <w:rFonts w:ascii="Calibri" w:hAnsi="Calibri" w:eastAsia="Heiti TC"/>
+          <w:rFonts w:ascii="Calibri" w:hAnsi="Calibri" w:eastAsia="Songti SC"/>
           <w:b w:val="0"/>
           <w:i/>
           <w:color w:val="667085"/>
@@ -687,13 +687,13 @@
       </w:pPr>
       <w:r>
         <w:rPr>
-          <w:rFonts w:ascii="Calibri" w:hAnsi="Calibri" w:eastAsia="Heiti TC"/>
+          <w:rFonts w:ascii="Calibri" w:hAnsi="Calibri" w:eastAsia="Songti SC"/>
           <w:b/>
           <w:i w:val="0"/>
           <w:color w:val="0B2545"/>
           <w:sz w:val="23"/>
         </w:rPr>
-        <w:t>1. 2026-06-05 前统一事件窗口执行手册</w:t>
+        <w:t>1. 中游材料产能缺口对先进封装与AI算力硬件供应链的传导风险</w:t>
       </w:r>
     </w:p>
     <w:p>
@@ -702,13 +702,13 @@
       </w:pPr>
       <w:r>
         <w:rPr>
-          <w:rFonts w:ascii="Calibri" w:hAnsi="Calibri" w:eastAsia="Heiti TC"/>
+          <w:rFonts w:ascii="Calibri" w:hAnsi="Calibri" w:eastAsia="Songti SC"/>
           <w:b w:val="0"/>
           <w:i w:val="0"/>
           <w:color w:val="667085"/>
           <w:sz w:val="17"/>
         </w:rPr>
-        <w:t>未识别 · AI 基础设施 · score 37.3</w:t>
+        <w:t>未识别 · 工业供给瓶颈 · score 53.6</w:t>
       </w:r>
     </w:p>
     <w:p>
@@ -717,13 +717,13 @@
       </w:pPr>
       <w:r>
         <w:rPr>
-          <w:rFonts w:ascii="Calibri" w:hAnsi="Calibri" w:eastAsia="Heiti TC"/>
+          <w:rFonts w:ascii="Calibri" w:hAnsi="Calibri" w:eastAsia="Songti SC"/>
           <w:b w:val="0"/>
           <w:i w:val="0"/>
           <w:color w:val="334155"/>
           <w:sz w:val="20"/>
         </w:rPr>
-        <w:t>板块: 572c9237-cf21-4d19-8f37-a9858dd88f7a - 研究记录（综合收尾） - 分析师: 首席策略师 (chief-strategist) - 作业日期: 2026-05-29 （Asia/Singapore） - 立场: synthesize — 把 prior r...</w:t>
+        <w:t>分析师：TMT行业分析师 - 立场：stress-test（压力测试） - 工作日期：2026-06-05（亚洲/新加坡） - 线程：8/8 — 收尾研究记录，闭合"镓→重稀土→石墨"级联线索</w:t>
       </w:r>
     </w:p>
     <w:p>
@@ -732,7 +732,7 @@
       </w:pPr>
       <w:r>
         <w:rPr>
-          <w:rFonts w:ascii="Calibri" w:hAnsi="Calibri" w:eastAsia="Heiti TC"/>
+          <w:rFonts w:ascii="Calibri" w:hAnsi="Calibri" w:eastAsia="Songti SC"/>
           <w:b w:val="0"/>
           <w:i w:val="0"/>
           <w:color w:val="667085"/>
@@ -745,9 +745,359 @@
           <w:rPr>
             <w:color w:val="285B9D"/>
             <w:u w:val="single"/>
-            <w:rFonts w:eastAsia="Heiti TC" w:ascii="Calibri" w:hAnsi="Calibri"/>
+            <w:rFonts w:eastAsia="Songti SC" w:ascii="Calibri" w:hAnsi="Calibri"/>
           </w:rPr>
-          <w:t>reports/archive-a5b4e69303f4</w:t>
+          <w:t>reports/archive-2c749d1148f9</w:t>
+        </w:r>
+      </w:hyperlink>
+    </w:p>
+    <w:p>
+      <w:pPr>
+        <w:spacing w:before="0" w:after="40" w:line="264" w:lineRule="auto"/>
+      </w:pPr>
+      <w:r>
+        <w:rPr>
+          <w:rFonts w:ascii="Calibri" w:hAnsi="Calibri" w:eastAsia="Songti SC"/>
+          <w:b/>
+          <w:i w:val="0"/>
+          <w:color w:val="0B2545"/>
+          <w:sz w:val="23"/>
+        </w:rPr>
+        <w:t>2. 2026-06-05 — 供给侧电力通胀下的美联储反应函数</w:t>
+      </w:r>
+    </w:p>
+    <w:p>
+      <w:pPr>
+        <w:spacing w:before="0" w:after="40" w:line="264" w:lineRule="auto"/>
+      </w:pPr>
+      <w:r>
+        <w:rPr>
+          <w:rFonts w:ascii="Calibri" w:hAnsi="Calibri" w:eastAsia="Songti SC"/>
+          <w:b w:val="0"/>
+          <w:i w:val="0"/>
+          <w:color w:val="667085"/>
+          <w:sz w:val="17"/>
+        </w:rPr>
+        <w:t>未识别 · 宏观通胀传导 · score 53.2</w:t>
+      </w:r>
+    </w:p>
+    <w:p>
+      <w:pPr>
+        <w:spacing w:before="0" w:after="100" w:line="264" w:lineRule="auto"/>
+      </w:pPr>
+      <w:r>
+        <w:rPr>
+          <w:rFonts w:ascii="Calibri" w:hAnsi="Calibri" w:eastAsia="Songti SC"/>
+          <w:b w:val="0"/>
+          <w:i w:val="0"/>
+          <w:color w:val="334155"/>
+          <w:sz w:val="20"/>
+        </w:rPr>
+        <w:t>工作日: 2026-06-05 分析师: 首席经济学家 立场: 压力测试 问题: 鉴于电网和能源瓶颈构成的非典型通胀，美联储在 Kevin Warsh 领导下是否会调高长期中性利率 r 估算？</w:t>
+      </w:r>
+    </w:p>
+    <w:p>
+      <w:pPr>
+        <w:spacing w:before="0" w:after="160" w:line="264" w:lineRule="auto"/>
+      </w:pPr>
+      <w:r>
+        <w:rPr>
+          <w:rFonts w:ascii="Calibri" w:hAnsi="Calibri" w:eastAsia="Songti SC"/>
+          <w:b w:val="0"/>
+          <w:i w:val="0"/>
+          <w:color w:val="667085"/>
+          <w:sz w:val="17"/>
+        </w:rPr>
+        <w:t xml:space="preserve">Report: </w:t>
+      </w:r>
+      <w:hyperlink r:id="rId19">
+        <w:r>
+          <w:rPr>
+            <w:color w:val="285B9D"/>
+            <w:u w:val="single"/>
+            <w:rFonts w:eastAsia="Songti SC" w:ascii="Calibri" w:hAnsi="Calibri"/>
+          </w:rPr>
+          <w:t>reports/archive-a1c74957ff03</w:t>
+        </w:r>
+      </w:hyperlink>
+    </w:p>
+    <w:p>
+      <w:pPr>
+        <w:spacing w:before="0" w:after="40" w:line="264" w:lineRule="auto"/>
+      </w:pPr>
+      <w:r>
+        <w:rPr>
+          <w:rFonts w:ascii="Calibri" w:hAnsi="Calibri" w:eastAsia="Songti SC"/>
+          <w:b/>
+          <w:i w:val="0"/>
+          <w:color w:val="0B2545"/>
+          <w:sz w:val="23"/>
+        </w:rPr>
+        <w:t>3. 政策陷阱：为什么监管审批与贸易干预无法在 12-18 个月窗口内打破电网变压器短缺瓶颈</w:t>
+      </w:r>
+    </w:p>
+    <w:p>
+      <w:pPr>
+        <w:spacing w:before="0" w:after="40" w:line="264" w:lineRule="auto"/>
+      </w:pPr>
+      <w:r>
+        <w:rPr>
+          <w:rFonts w:ascii="Calibri" w:hAnsi="Calibri" w:eastAsia="Songti SC"/>
+          <w:b w:val="0"/>
+          <w:i w:val="0"/>
+          <w:color w:val="667085"/>
+          <w:sz w:val="17"/>
+        </w:rPr>
+        <w:t>未识别 · 电力与电网 · score 50.9</w:t>
+      </w:r>
+    </w:p>
+    <w:p>
+      <w:pPr>
+        <w:spacing w:before="0" w:after="100" w:line="264" w:lineRule="auto"/>
+      </w:pPr>
+      <w:r>
+        <w:rPr>
+          <w:rFonts w:ascii="Calibri" w:hAnsi="Calibri" w:eastAsia="Songti SC"/>
+          <w:b w:val="0"/>
+          <w:i w:val="0"/>
+          <w:color w:val="334155"/>
+          <w:sz w:val="20"/>
+        </w:rPr>
+        <w:t>政策陷阱：为什么监管审批与贸易干预无法在 12-18 个月窗口内打破电网变压器短缺瓶颈</w:t>
+      </w:r>
+    </w:p>
+    <w:p>
+      <w:pPr>
+        <w:spacing w:before="0" w:after="160" w:line="264" w:lineRule="auto"/>
+      </w:pPr>
+      <w:r>
+        <w:rPr>
+          <w:rFonts w:ascii="Calibri" w:hAnsi="Calibri" w:eastAsia="Songti SC"/>
+          <w:b w:val="0"/>
+          <w:i w:val="0"/>
+          <w:color w:val="667085"/>
+          <w:sz w:val="17"/>
+        </w:rPr>
+        <w:t xml:space="preserve">Report: </w:t>
+      </w:r>
+      <w:hyperlink r:id="rId20">
+        <w:r>
+          <w:rPr>
+            <w:color w:val="285B9D"/>
+            <w:u w:val="single"/>
+            <w:rFonts w:eastAsia="Songti SC" w:ascii="Calibri" w:hAnsi="Calibri"/>
+          </w:rPr>
+          <w:t>reports/archive-4f163e7aace2</w:t>
+        </w:r>
+      </w:hyperlink>
+    </w:p>
+    <w:p>
+      <w:pPr>
+        <w:spacing w:before="0" w:after="40" w:line="264" w:lineRule="auto"/>
+      </w:pPr>
+      <w:r>
+        <w:rPr>
+          <w:rFonts w:ascii="Calibri" w:hAnsi="Calibri" w:eastAsia="Songti SC"/>
+          <w:b/>
+          <w:i w:val="0"/>
+          <w:color w:val="0B2545"/>
+          <w:sz w:val="23"/>
+        </w:rPr>
+        <w:t>4. 铜与电工钢供给侧约束：矿端供应缺口、冶炼产能与GOES瓶颈</w:t>
+      </w:r>
+    </w:p>
+    <w:p>
+      <w:pPr>
+        <w:spacing w:before="0" w:after="40" w:line="264" w:lineRule="auto"/>
+      </w:pPr>
+      <w:r>
+        <w:rPr>
+          <w:rFonts w:ascii="Calibri" w:hAnsi="Calibri" w:eastAsia="Songti SC"/>
+          <w:b w:val="0"/>
+          <w:i w:val="0"/>
+          <w:color w:val="667085"/>
+          <w:sz w:val="17"/>
+        </w:rPr>
+        <w:t>未识别 · 工业供给瓶颈 · score 50.0</w:t>
+      </w:r>
+    </w:p>
+    <w:p>
+      <w:pPr>
+        <w:spacing w:before="0" w:after="100" w:line="264" w:lineRule="auto"/>
+      </w:pPr>
+      <w:r>
+        <w:rPr>
+          <w:rFonts w:ascii="Calibri" w:hAnsi="Calibri" w:eastAsia="Songti SC"/>
+          <w:b w:val="0"/>
+          <w:i w:val="0"/>
+          <w:color w:val="334155"/>
+          <w:sz w:val="20"/>
+        </w:rPr>
+        <w:t>铜与电工钢供给侧约束：矿端供应缺口、冶炼产能与GOES瓶颈 日期：2026-06-05 分析师：材料行业分析师 (materials-analyst) 立场：支持 (Support) — 支持能源行业分析师 (energy-analyst) 在 pr...</w:t>
+      </w:r>
+    </w:p>
+    <w:p>
+      <w:pPr>
+        <w:spacing w:before="0" w:after="160" w:line="264" w:lineRule="auto"/>
+      </w:pPr>
+      <w:r>
+        <w:rPr>
+          <w:rFonts w:ascii="Calibri" w:hAnsi="Calibri" w:eastAsia="Songti SC"/>
+          <w:b w:val="0"/>
+          <w:i w:val="0"/>
+          <w:color w:val="667085"/>
+          <w:sz w:val="17"/>
+        </w:rPr>
+        <w:t xml:space="preserve">Report: </w:t>
+      </w:r>
+      <w:hyperlink r:id="rId21">
+        <w:r>
+          <w:rPr>
+            <w:color w:val="285B9D"/>
+            <w:u w:val="single"/>
+            <w:rFonts w:eastAsia="Songti SC" w:ascii="Calibri" w:hAnsi="Calibri"/>
+          </w:rPr>
+          <w:t>reports/archive-f1cc16439797</w:t>
+        </w:r>
+      </w:hyperlink>
+    </w:p>
+    <w:p>
+      <w:pPr>
+        <w:spacing w:before="0" w:after="40" w:line="264" w:lineRule="auto"/>
+      </w:pPr>
+      <w:r>
+        <w:rPr>
+          <w:rFonts w:ascii="Calibri" w:hAnsi="Calibri" w:eastAsia="Songti SC"/>
+          <w:b/>
+          <w:i w:val="0"/>
+          <w:color w:val="0B2545"/>
+          <w:sz w:val="23"/>
+        </w:rPr>
+        <w:t>5. 电力基础设施瓶颈：输配电设备供应链压力与公用事业资产重估</w:t>
+      </w:r>
+    </w:p>
+    <w:p>
+      <w:pPr>
+        <w:spacing w:before="0" w:after="40" w:line="264" w:lineRule="auto"/>
+      </w:pPr>
+      <w:r>
+        <w:rPr>
+          <w:rFonts w:ascii="Calibri" w:hAnsi="Calibri" w:eastAsia="Songti SC"/>
+          <w:b w:val="0"/>
+          <w:i w:val="0"/>
+          <w:color w:val="667085"/>
+          <w:sz w:val="17"/>
+        </w:rPr>
+        <w:t>未识别 · 工业供给瓶颈 · score 49.9</w:t>
+      </w:r>
+    </w:p>
+    <w:p>
+      <w:pPr>
+        <w:spacing w:before="0" w:after="100" w:line="264" w:lineRule="auto"/>
+      </w:pPr>
+      <w:r>
+        <w:rPr>
+          <w:rFonts w:ascii="Calibri" w:hAnsi="Calibri" w:eastAsia="Songti SC"/>
+          <w:b w:val="0"/>
+          <w:i w:val="0"/>
+          <w:color w:val="334155"/>
+          <w:sz w:val="20"/>
+        </w:rPr>
+        <w:t>电力基础设施瓶颈：输配电设备供应链压力与公用事业资产重估 分析日期： 2026-06-05 分析师： Utilities Analyst 立场： 支持 (基于 prior research notes与 prior research notes的推论)</w:t>
+      </w:r>
+    </w:p>
+    <w:p>
+      <w:pPr>
+        <w:spacing w:before="0" w:after="160" w:line="264" w:lineRule="auto"/>
+      </w:pPr>
+      <w:r>
+        <w:rPr>
+          <w:rFonts w:ascii="Calibri" w:hAnsi="Calibri" w:eastAsia="Songti SC"/>
+          <w:b w:val="0"/>
+          <w:i w:val="0"/>
+          <w:color w:val="667085"/>
+          <w:sz w:val="17"/>
+        </w:rPr>
+        <w:t xml:space="preserve">Report: </w:t>
+      </w:r>
+      <w:hyperlink r:id="rId22">
+        <w:r>
+          <w:rPr>
+            <w:color w:val="285B9D"/>
+            <w:u w:val="single"/>
+            <w:rFonts w:eastAsia="Songti SC" w:ascii="Calibri" w:hAnsi="Calibri"/>
+          </w:rPr>
+          <w:t>reports/archive-abe8b95b573c</w:t>
+        </w:r>
+      </w:hyperlink>
+    </w:p>
+    <w:p>
+      <w:pPr>
+        <w:spacing w:before="0" w:after="40" w:line="264" w:lineRule="auto"/>
+      </w:pPr>
+      <w:r>
+        <w:rPr>
+          <w:rFonts w:ascii="Calibri" w:hAnsi="Calibri" w:eastAsia="Songti SC"/>
+          <w:b/>
+          <w:i w:val="0"/>
+          <w:color w:val="0B2545"/>
+          <w:sz w:val="23"/>
+        </w:rPr>
+        <w:t>6. 研究记录07 · 能源行业分析师压力测试报告</w:t>
+      </w:r>
+    </w:p>
+    <w:p>
+      <w:pPr>
+        <w:spacing w:before="0" w:after="40" w:line="264" w:lineRule="auto"/>
+      </w:pPr>
+      <w:r>
+        <w:rPr>
+          <w:rFonts w:ascii="Calibri" w:hAnsi="Calibri" w:eastAsia="Songti SC"/>
+          <w:b w:val="0"/>
+          <w:i w:val="0"/>
+          <w:color w:val="667085"/>
+          <w:sz w:val="17"/>
+        </w:rPr>
+        <w:t>未识别 · AI 基础设施 · score 49.4</w:t>
+      </w:r>
+    </w:p>
+    <w:p>
+      <w:pPr>
+        <w:spacing w:before="0" w:after="100" w:line="264" w:lineRule="auto"/>
+      </w:pPr>
+      <w:r>
+        <w:rPr>
+          <w:rFonts w:ascii="Calibri" w:hAnsi="Calibri" w:eastAsia="Songti SC"/>
+          <w:b w:val="0"/>
+          <w:i w:val="0"/>
+          <w:color w:val="334155"/>
+          <w:sz w:val="20"/>
+        </w:rPr>
+        <w:t>工作日期：2026-06-05（亚洲/新加坡） - 板块：AI 基础设施电力供给瓶颈及其对算力扩张的压制风险 - 立场：stress-test（对 research note/research note 的量化减仓规则做物理性前置条件压力测...</w:t>
+      </w:r>
+    </w:p>
+    <w:p>
+      <w:pPr>
+        <w:spacing w:before="0" w:after="160" w:line="264" w:lineRule="auto"/>
+      </w:pPr>
+      <w:r>
+        <w:rPr>
+          <w:rFonts w:ascii="Calibri" w:hAnsi="Calibri" w:eastAsia="Songti SC"/>
+          <w:b w:val="0"/>
+          <w:i w:val="0"/>
+          <w:color w:val="667085"/>
+          <w:sz w:val="17"/>
+        </w:rPr>
+        <w:t xml:space="preserve">Report: </w:t>
+      </w:r>
+      <w:hyperlink r:id="rId23">
+        <w:r>
+          <w:rPr>
+            <w:color w:val="285B9D"/>
+            <w:u w:val="single"/>
+            <w:rFonts w:eastAsia="Songti SC" w:ascii="Calibri" w:hAnsi="Calibri"/>
+          </w:rPr>
+          <w:t>reports/archive-11cd11efbd24</w:t>
         </w:r>
       </w:hyperlink>
     </w:p>
@@ -765,7 +1115,7 @@
       </w:pPr>
       <w:r>
         <w:rPr>
-          <w:rFonts w:ascii="Calibri" w:hAnsi="Calibri" w:eastAsia="Heiti TC"/>
+          <w:rFonts w:ascii="Calibri" w:hAnsi="Calibri" w:eastAsia="Songti SC"/>
           <w:b/>
           <w:i w:val="0"/>
           <w:color w:val="0B2545"/>
@@ -780,7 +1130,7 @@
       </w:pPr>
       <w:r>
         <w:rPr>
-          <w:rFonts w:ascii="Calibri" w:hAnsi="Calibri" w:eastAsia="Heiti TC"/>
+          <w:rFonts w:ascii="Calibri" w:hAnsi="Calibri" w:eastAsia="Songti SC"/>
           <w:b w:val="0"/>
           <w:i w:val="0"/>
           <w:color w:val="334155"/>
@@ -795,7 +1145,7 @@
       </w:pPr>
       <w:r>
         <w:rPr>
-          <w:rFonts w:ascii="Calibri" w:hAnsi="Calibri" w:eastAsia="Heiti TC"/>
+          <w:rFonts w:ascii="Calibri" w:hAnsi="Calibri" w:eastAsia="Songti SC"/>
           <w:b w:val="0"/>
           <w:i w:val="0"/>
           <w:color w:val="667085"/>
@@ -808,7 +1158,7 @@
           <w:rPr>
             <w:color w:val="285B9D"/>
             <w:u w:val="single"/>
-            <w:rFonts w:eastAsia="Heiti TC" w:ascii="Calibri" w:hAnsi="Calibri"/>
+            <w:rFonts w:eastAsia="Songti SC" w:ascii="Calibri" w:hAnsi="Calibri"/>
           </w:rPr>
           <w:t>reports/archive-5166d41eec14</w:t>
         </w:r>
@@ -820,7 +1170,7 @@
       </w:pPr>
       <w:r>
         <w:rPr>
-          <w:rFonts w:ascii="Calibri" w:hAnsi="Calibri" w:eastAsia="Heiti TC"/>
+          <w:rFonts w:ascii="Calibri" w:hAnsi="Calibri" w:eastAsia="Songti SC"/>
           <w:b/>
           <w:i w:val="0"/>
           <w:color w:val="0B2545"/>
@@ -835,7 +1185,7 @@
       </w:pPr>
       <w:r>
         <w:rPr>
-          <w:rFonts w:ascii="Calibri" w:hAnsi="Calibri" w:eastAsia="Heiti TC"/>
+          <w:rFonts w:ascii="Calibri" w:hAnsi="Calibri" w:eastAsia="Songti SC"/>
           <w:b w:val="0"/>
           <w:i w:val="0"/>
           <w:color w:val="334155"/>
@@ -850,7 +1200,7 @@
       </w:pPr>
       <w:r>
         <w:rPr>
-          <w:rFonts w:ascii="Calibri" w:hAnsi="Calibri" w:eastAsia="Heiti TC"/>
+          <w:rFonts w:ascii="Calibri" w:hAnsi="Calibri" w:eastAsia="Songti SC"/>
           <w:b w:val="0"/>
           <w:i w:val="0"/>
           <w:color w:val="667085"/>
@@ -858,12 +1208,12 @@
         </w:rPr>
         <w:t xml:space="preserve">Report: </w:t>
       </w:r>
-      <w:hyperlink r:id="rId18">
+      <w:hyperlink r:id="rId24">
         <w:r>
           <w:rPr>
             <w:color w:val="285B9D"/>
             <w:u w:val="single"/>
-            <w:rFonts w:eastAsia="Heiti TC" w:ascii="Calibri" w:hAnsi="Calibri"/>
+            <w:rFonts w:eastAsia="Songti SC" w:ascii="Calibri" w:hAnsi="Calibri"/>
           </w:rPr>
           <w:t>reports/archive-035608ac057a</w:t>
         </w:r>
@@ -875,7 +1225,7 @@
       </w:pPr>
       <w:r>
         <w:rPr>
-          <w:rFonts w:ascii="Calibri" w:hAnsi="Calibri" w:eastAsia="Heiti TC"/>
+          <w:rFonts w:ascii="Calibri" w:hAnsi="Calibri" w:eastAsia="Songti SC"/>
           <w:b/>
           <w:i w:val="0"/>
           <w:color w:val="0B2545"/>
@@ -890,7 +1240,7 @@
       </w:pPr>
       <w:r>
         <w:rPr>
-          <w:rFonts w:ascii="Calibri" w:hAnsi="Calibri" w:eastAsia="Heiti TC"/>
+          <w:rFonts w:ascii="Calibri" w:hAnsi="Calibri" w:eastAsia="Songti SC"/>
           <w:b w:val="0"/>
           <w:i w:val="0"/>
           <w:color w:val="334155"/>
@@ -905,7 +1255,7 @@
       </w:pPr>
       <w:r>
         <w:rPr>
-          <w:rFonts w:ascii="Calibri" w:hAnsi="Calibri" w:eastAsia="Heiti TC"/>
+          <w:rFonts w:ascii="Calibri" w:hAnsi="Calibri" w:eastAsia="Songti SC"/>
           <w:b w:val="0"/>
           <w:i w:val="0"/>
           <w:color w:val="667085"/>
@@ -913,12 +1263,12 @@
         </w:rPr>
         <w:t xml:space="preserve">Report: </w:t>
       </w:r>
-      <w:hyperlink r:id="rId19">
+      <w:hyperlink r:id="rId25">
         <w:r>
           <w:rPr>
             <w:color w:val="285B9D"/>
             <w:u w:val="single"/>
-            <w:rFonts w:eastAsia="Heiti TC" w:ascii="Calibri" w:hAnsi="Calibri"/>
+            <w:rFonts w:eastAsia="Songti SC" w:ascii="Calibri" w:hAnsi="Calibri"/>
           </w:rPr>
           <w:t>reports/archive-1ba0209b8947</w:t>
         </w:r>
@@ -961,7 +1311,7 @@
             <w:r/>
             <w:r>
               <w:rPr>
-                <w:rFonts w:ascii="Calibri" w:hAnsi="Calibri" w:eastAsia="Heiti TC"/>
+                <w:rFonts w:ascii="Calibri" w:hAnsi="Calibri" w:eastAsia="Songti SC"/>
                 <w:b/>
                 <w:color w:val="475569"/>
                 <w:sz w:val="18"/>
@@ -984,7 +1334,7 @@
             <w:r/>
             <w:r>
               <w:rPr>
-                <w:rFonts w:ascii="Calibri" w:hAnsi="Calibri" w:eastAsia="Heiti TC"/>
+                <w:rFonts w:ascii="Calibri" w:hAnsi="Calibri" w:eastAsia="Songti SC"/>
                 <w:b/>
                 <w:color w:val="475569"/>
                 <w:sz w:val="18"/>
@@ -1007,7 +1357,7 @@
             <w:r/>
             <w:r>
               <w:rPr>
-                <w:rFonts w:ascii="Calibri" w:hAnsi="Calibri" w:eastAsia="Heiti TC"/>
+                <w:rFonts w:ascii="Calibri" w:hAnsi="Calibri" w:eastAsia="Songti SC"/>
                 <w:b/>
                 <w:color w:val="475569"/>
                 <w:sz w:val="18"/>
@@ -1030,7 +1380,7 @@
             <w:r/>
             <w:r>
               <w:rPr>
-                <w:rFonts w:ascii="Calibri" w:hAnsi="Calibri" w:eastAsia="Heiti TC"/>
+                <w:rFonts w:ascii="Calibri" w:hAnsi="Calibri" w:eastAsia="Songti SC"/>
                 <w:b/>
                 <w:color w:val="475569"/>
                 <w:sz w:val="18"/>
@@ -1053,7 +1403,7 @@
             <w:r/>
             <w:r>
               <w:rPr>
-                <w:rFonts w:ascii="Calibri" w:hAnsi="Calibri" w:eastAsia="Heiti TC"/>
+                <w:rFonts w:ascii="Calibri" w:hAnsi="Calibri" w:eastAsia="Songti SC"/>
                 <w:b/>
                 <w:color w:val="475569"/>
                 <w:sz w:val="18"/>
@@ -1076,12 +1426,12 @@
             <w:r/>
             <w:r>
               <w:rPr>
-                <w:rFonts w:ascii="Calibri" w:hAnsi="Calibri" w:eastAsia="Heiti TC"/>
+                <w:rFonts w:ascii="Calibri" w:hAnsi="Calibri" w:eastAsia="Songti SC"/>
                 <w:b w:val="0"/>
                 <w:color w:val="111827"/>
                 <w:sz w:val="17"/>
               </w:rPr>
-              <w:t>2026-06-05 前统一事件窗口执行手册</w:t>
+              <w:t>中游材料产能缺口对先进封装与AI算力硬件供应链的传导风险</w:t>
             </w:r>
           </w:p>
         </w:tc>
@@ -1097,7 +1447,7 @@
             <w:r/>
             <w:r>
               <w:rPr>
-                <w:rFonts w:ascii="Calibri" w:hAnsi="Calibri" w:eastAsia="Heiti TC"/>
+                <w:rFonts w:ascii="Calibri" w:hAnsi="Calibri" w:eastAsia="Songti SC"/>
                 <w:b w:val="0"/>
                 <w:color w:val="111827"/>
                 <w:sz w:val="16"/>
@@ -1118,7 +1468,552 @@
             <w:r/>
             <w:r>
               <w:rPr>
-                <w:rFonts w:ascii="Calibri" w:hAnsi="Calibri" w:eastAsia="Heiti TC"/>
+                <w:rFonts w:ascii="Calibri" w:hAnsi="Calibri" w:eastAsia="Songti SC"/>
+                <w:b w:val="0"/>
+                <w:color w:val="111827"/>
+                <w:sz w:val="16"/>
+              </w:rPr>
+              <w:t>工业供给瓶颈</w:t>
+            </w:r>
+          </w:p>
+        </w:tc>
+        <w:tc>
+          <w:tcPr>
+            <w:tcW w:type="dxa" w:w="900"/>
+            <w:vAlign w:val="center"/>
+          </w:tcPr>
+          <w:p>
+            <w:pPr>
+              <w:spacing w:before="0" w:after="0"/>
+              <w:jc w:val="center"/>
+            </w:pPr>
+            <w:r/>
+            <w:r>
+              <w:rPr>
+                <w:rFonts w:ascii="Calibri" w:hAnsi="Calibri" w:eastAsia="Songti SC"/>
+                <w:b/>
+                <w:color w:val="111827"/>
+                <w:sz w:val="17"/>
+              </w:rPr>
+              <w:t>53.6</w:t>
+            </w:r>
+          </w:p>
+        </w:tc>
+        <w:tc>
+          <w:tcPr>
+            <w:tcW w:type="dxa" w:w="1500"/>
+            <w:vAlign w:val="center"/>
+          </w:tcPr>
+          <w:p>
+            <w:pPr>
+              <w:spacing w:before="0" w:after="0"/>
+              <w:jc w:val="center"/>
+            </w:pPr>
+            <w:r/>
+            <w:r>
+              <w:rPr>
+                <w:rFonts w:ascii="Calibri" w:hAnsi="Calibri" w:eastAsia="Songti SC"/>
+                <w:b w:val="0"/>
+                <w:color w:val="111827"/>
+                <w:sz w:val="16"/>
+              </w:rPr>
+              <w:t>风险 2</w:t>
+            </w:r>
+          </w:p>
+        </w:tc>
+      </w:tr>
+      <w:tr>
+        <w:tc>
+          <w:tcPr>
+            <w:tcW w:type="dxa" w:w="3720"/>
+            <w:vAlign w:val="center"/>
+          </w:tcPr>
+          <w:p>
+            <w:pPr>
+              <w:spacing w:before="0" w:after="0"/>
+            </w:pPr>
+            <w:r/>
+            <w:r>
+              <w:rPr>
+                <w:rFonts w:ascii="Calibri" w:hAnsi="Calibri" w:eastAsia="Songti SC"/>
+                <w:b w:val="0"/>
+                <w:color w:val="111827"/>
+                <w:sz w:val="17"/>
+              </w:rPr>
+              <w:t>2026-06-05 — 供给侧电力通胀下的美联储反应函数</w:t>
+            </w:r>
+          </w:p>
+        </w:tc>
+        <w:tc>
+          <w:tcPr>
+            <w:tcW w:type="dxa" w:w="1560"/>
+            <w:vAlign w:val="center"/>
+          </w:tcPr>
+          <w:p>
+            <w:pPr>
+              <w:spacing w:before="0" w:after="0"/>
+            </w:pPr>
+            <w:r/>
+            <w:r>
+              <w:rPr>
+                <w:rFonts w:ascii="Calibri" w:hAnsi="Calibri" w:eastAsia="Songti SC"/>
+                <w:b w:val="0"/>
+                <w:color w:val="111827"/>
+                <w:sz w:val="16"/>
+              </w:rPr>
+              <w:t>未识别</w:t>
+            </w:r>
+          </w:p>
+        </w:tc>
+        <w:tc>
+          <w:tcPr>
+            <w:tcW w:type="dxa" w:w="1680"/>
+            <w:vAlign w:val="center"/>
+          </w:tcPr>
+          <w:p>
+            <w:pPr>
+              <w:spacing w:before="0" w:after="0"/>
+            </w:pPr>
+            <w:r/>
+            <w:r>
+              <w:rPr>
+                <w:rFonts w:ascii="Calibri" w:hAnsi="Calibri" w:eastAsia="Songti SC"/>
+                <w:b w:val="0"/>
+                <w:color w:val="111827"/>
+                <w:sz w:val="16"/>
+              </w:rPr>
+              <w:t>宏观通胀传导</w:t>
+            </w:r>
+          </w:p>
+        </w:tc>
+        <w:tc>
+          <w:tcPr>
+            <w:tcW w:type="dxa" w:w="900"/>
+            <w:vAlign w:val="center"/>
+          </w:tcPr>
+          <w:p>
+            <w:pPr>
+              <w:spacing w:before="0" w:after="0"/>
+              <w:jc w:val="center"/>
+            </w:pPr>
+            <w:r/>
+            <w:r>
+              <w:rPr>
+                <w:rFonts w:ascii="Calibri" w:hAnsi="Calibri" w:eastAsia="Songti SC"/>
+                <w:b/>
+                <w:color w:val="111827"/>
+                <w:sz w:val="17"/>
+              </w:rPr>
+              <w:t>53.2</w:t>
+            </w:r>
+          </w:p>
+        </w:tc>
+        <w:tc>
+          <w:tcPr>
+            <w:tcW w:type="dxa" w:w="1500"/>
+            <w:vAlign w:val="center"/>
+          </w:tcPr>
+          <w:p>
+            <w:pPr>
+              <w:spacing w:before="0" w:after="0"/>
+              <w:jc w:val="center"/>
+            </w:pPr>
+            <w:r/>
+            <w:r>
+              <w:rPr>
+                <w:rFonts w:ascii="Calibri" w:hAnsi="Calibri" w:eastAsia="Songti SC"/>
+                <w:b w:val="0"/>
+                <w:color w:val="111827"/>
+                <w:sz w:val="16"/>
+              </w:rPr>
+              <w:t>风险 3</w:t>
+            </w:r>
+          </w:p>
+        </w:tc>
+      </w:tr>
+      <w:tr>
+        <w:tc>
+          <w:tcPr>
+            <w:tcW w:type="dxa" w:w="3720"/>
+            <w:vAlign w:val="center"/>
+          </w:tcPr>
+          <w:p>
+            <w:pPr>
+              <w:spacing w:before="0" w:after="0"/>
+            </w:pPr>
+            <w:r/>
+            <w:r>
+              <w:rPr>
+                <w:rFonts w:ascii="Calibri" w:hAnsi="Calibri" w:eastAsia="Songti SC"/>
+                <w:b w:val="0"/>
+                <w:color w:val="111827"/>
+                <w:sz w:val="17"/>
+              </w:rPr>
+              <w:t>政策陷阱：为什么监管审批与贸易干预无法在 12-18 个月窗口内打破电网变压器短缺瓶颈</w:t>
+            </w:r>
+          </w:p>
+        </w:tc>
+        <w:tc>
+          <w:tcPr>
+            <w:tcW w:type="dxa" w:w="1560"/>
+            <w:vAlign w:val="center"/>
+          </w:tcPr>
+          <w:p>
+            <w:pPr>
+              <w:spacing w:before="0" w:after="0"/>
+            </w:pPr>
+            <w:r/>
+            <w:r>
+              <w:rPr>
+                <w:rFonts w:ascii="Calibri" w:hAnsi="Calibri" w:eastAsia="Songti SC"/>
+                <w:b w:val="0"/>
+                <w:color w:val="111827"/>
+                <w:sz w:val="16"/>
+              </w:rPr>
+              <w:t>未识别</w:t>
+            </w:r>
+          </w:p>
+        </w:tc>
+        <w:tc>
+          <w:tcPr>
+            <w:tcW w:type="dxa" w:w="1680"/>
+            <w:vAlign w:val="center"/>
+          </w:tcPr>
+          <w:p>
+            <w:pPr>
+              <w:spacing w:before="0" w:after="0"/>
+            </w:pPr>
+            <w:r/>
+            <w:r>
+              <w:rPr>
+                <w:rFonts w:ascii="Calibri" w:hAnsi="Calibri" w:eastAsia="Songti SC"/>
+                <w:b w:val="0"/>
+                <w:color w:val="111827"/>
+                <w:sz w:val="16"/>
+              </w:rPr>
+              <w:t>电力与电网</w:t>
+            </w:r>
+          </w:p>
+        </w:tc>
+        <w:tc>
+          <w:tcPr>
+            <w:tcW w:type="dxa" w:w="900"/>
+            <w:vAlign w:val="center"/>
+          </w:tcPr>
+          <w:p>
+            <w:pPr>
+              <w:spacing w:before="0" w:after="0"/>
+              <w:jc w:val="center"/>
+            </w:pPr>
+            <w:r/>
+            <w:r>
+              <w:rPr>
+                <w:rFonts w:ascii="Calibri" w:hAnsi="Calibri" w:eastAsia="Songti SC"/>
+                <w:b/>
+                <w:color w:val="111827"/>
+                <w:sz w:val="17"/>
+              </w:rPr>
+              <w:t>50.9</w:t>
+            </w:r>
+          </w:p>
+        </w:tc>
+        <w:tc>
+          <w:tcPr>
+            <w:tcW w:type="dxa" w:w="1500"/>
+            <w:vAlign w:val="center"/>
+          </w:tcPr>
+          <w:p>
+            <w:pPr>
+              <w:spacing w:before="0" w:after="0"/>
+              <w:jc w:val="center"/>
+            </w:pPr>
+            <w:r/>
+            <w:r>
+              <w:rPr>
+                <w:rFonts w:ascii="Calibri" w:hAnsi="Calibri" w:eastAsia="Songti SC"/>
+                <w:b w:val="0"/>
+                <w:color w:val="111827"/>
+                <w:sz w:val="16"/>
+              </w:rPr>
+              <w:t>风险 4</w:t>
+            </w:r>
+          </w:p>
+        </w:tc>
+      </w:tr>
+      <w:tr>
+        <w:tc>
+          <w:tcPr>
+            <w:tcW w:type="dxa" w:w="3720"/>
+            <w:vAlign w:val="center"/>
+          </w:tcPr>
+          <w:p>
+            <w:pPr>
+              <w:spacing w:before="0" w:after="0"/>
+            </w:pPr>
+            <w:r/>
+            <w:r>
+              <w:rPr>
+                <w:rFonts w:ascii="Calibri" w:hAnsi="Calibri" w:eastAsia="Songti SC"/>
+                <w:b w:val="0"/>
+                <w:color w:val="111827"/>
+                <w:sz w:val="17"/>
+              </w:rPr>
+              <w:t>铜与电工钢供给侧约束：矿端供应缺口、冶炼产能与GOES瓶颈</w:t>
+            </w:r>
+          </w:p>
+        </w:tc>
+        <w:tc>
+          <w:tcPr>
+            <w:tcW w:type="dxa" w:w="1560"/>
+            <w:vAlign w:val="center"/>
+          </w:tcPr>
+          <w:p>
+            <w:pPr>
+              <w:spacing w:before="0" w:after="0"/>
+            </w:pPr>
+            <w:r/>
+            <w:r>
+              <w:rPr>
+                <w:rFonts w:ascii="Calibri" w:hAnsi="Calibri" w:eastAsia="Songti SC"/>
+                <w:b w:val="0"/>
+                <w:color w:val="111827"/>
+                <w:sz w:val="16"/>
+              </w:rPr>
+              <w:t>未识别</w:t>
+            </w:r>
+          </w:p>
+        </w:tc>
+        <w:tc>
+          <w:tcPr>
+            <w:tcW w:type="dxa" w:w="1680"/>
+            <w:vAlign w:val="center"/>
+          </w:tcPr>
+          <w:p>
+            <w:pPr>
+              <w:spacing w:before="0" w:after="0"/>
+            </w:pPr>
+            <w:r/>
+            <w:r>
+              <w:rPr>
+                <w:rFonts w:ascii="Calibri" w:hAnsi="Calibri" w:eastAsia="Songti SC"/>
+                <w:b w:val="0"/>
+                <w:color w:val="111827"/>
+                <w:sz w:val="16"/>
+              </w:rPr>
+              <w:t>工业供给瓶颈</w:t>
+            </w:r>
+          </w:p>
+        </w:tc>
+        <w:tc>
+          <w:tcPr>
+            <w:tcW w:type="dxa" w:w="900"/>
+            <w:vAlign w:val="center"/>
+          </w:tcPr>
+          <w:p>
+            <w:pPr>
+              <w:spacing w:before="0" w:after="0"/>
+              <w:jc w:val="center"/>
+            </w:pPr>
+            <w:r/>
+            <w:r>
+              <w:rPr>
+                <w:rFonts w:ascii="Calibri" w:hAnsi="Calibri" w:eastAsia="Songti SC"/>
+                <w:b/>
+                <w:color w:val="111827"/>
+                <w:sz w:val="17"/>
+              </w:rPr>
+              <w:t>50.0</w:t>
+            </w:r>
+          </w:p>
+        </w:tc>
+        <w:tc>
+          <w:tcPr>
+            <w:tcW w:type="dxa" w:w="1500"/>
+            <w:vAlign w:val="center"/>
+          </w:tcPr>
+          <w:p>
+            <w:pPr>
+              <w:spacing w:before="0" w:after="0"/>
+              <w:jc w:val="center"/>
+            </w:pPr>
+            <w:r/>
+            <w:r>
+              <w:rPr>
+                <w:rFonts w:ascii="Calibri" w:hAnsi="Calibri" w:eastAsia="Songti SC"/>
+                <w:b w:val="0"/>
+                <w:color w:val="111827"/>
+                <w:sz w:val="16"/>
+              </w:rPr>
+              <w:t>风险 2</w:t>
+            </w:r>
+          </w:p>
+        </w:tc>
+      </w:tr>
+      <w:tr>
+        <w:tc>
+          <w:tcPr>
+            <w:tcW w:type="dxa" w:w="3720"/>
+            <w:vAlign w:val="center"/>
+          </w:tcPr>
+          <w:p>
+            <w:pPr>
+              <w:spacing w:before="0" w:after="0"/>
+            </w:pPr>
+            <w:r/>
+            <w:r>
+              <w:rPr>
+                <w:rFonts w:ascii="Calibri" w:hAnsi="Calibri" w:eastAsia="Songti SC"/>
+                <w:b w:val="0"/>
+                <w:color w:val="111827"/>
+                <w:sz w:val="17"/>
+              </w:rPr>
+              <w:t>电力基础设施瓶颈：输配电设备供应链压力与公用事业资产重估</w:t>
+            </w:r>
+          </w:p>
+        </w:tc>
+        <w:tc>
+          <w:tcPr>
+            <w:tcW w:type="dxa" w:w="1560"/>
+            <w:vAlign w:val="center"/>
+          </w:tcPr>
+          <w:p>
+            <w:pPr>
+              <w:spacing w:before="0" w:after="0"/>
+            </w:pPr>
+            <w:r/>
+            <w:r>
+              <w:rPr>
+                <w:rFonts w:ascii="Calibri" w:hAnsi="Calibri" w:eastAsia="Songti SC"/>
+                <w:b w:val="0"/>
+                <w:color w:val="111827"/>
+                <w:sz w:val="16"/>
+              </w:rPr>
+              <w:t>未识别</w:t>
+            </w:r>
+          </w:p>
+        </w:tc>
+        <w:tc>
+          <w:tcPr>
+            <w:tcW w:type="dxa" w:w="1680"/>
+            <w:vAlign w:val="center"/>
+          </w:tcPr>
+          <w:p>
+            <w:pPr>
+              <w:spacing w:before="0" w:after="0"/>
+            </w:pPr>
+            <w:r/>
+            <w:r>
+              <w:rPr>
+                <w:rFonts w:ascii="Calibri" w:hAnsi="Calibri" w:eastAsia="Songti SC"/>
+                <w:b w:val="0"/>
+                <w:color w:val="111827"/>
+                <w:sz w:val="16"/>
+              </w:rPr>
+              <w:t>工业供给瓶颈</w:t>
+            </w:r>
+          </w:p>
+        </w:tc>
+        <w:tc>
+          <w:tcPr>
+            <w:tcW w:type="dxa" w:w="900"/>
+            <w:vAlign w:val="center"/>
+          </w:tcPr>
+          <w:p>
+            <w:pPr>
+              <w:spacing w:before="0" w:after="0"/>
+              <w:jc w:val="center"/>
+            </w:pPr>
+            <w:r/>
+            <w:r>
+              <w:rPr>
+                <w:rFonts w:ascii="Calibri" w:hAnsi="Calibri" w:eastAsia="Songti SC"/>
+                <w:b/>
+                <w:color w:val="111827"/>
+                <w:sz w:val="17"/>
+              </w:rPr>
+              <w:t>49.9</w:t>
+            </w:r>
+          </w:p>
+        </w:tc>
+        <w:tc>
+          <w:tcPr>
+            <w:tcW w:type="dxa" w:w="1500"/>
+            <w:vAlign w:val="center"/>
+          </w:tcPr>
+          <w:p>
+            <w:pPr>
+              <w:spacing w:before="0" w:after="0"/>
+              <w:jc w:val="center"/>
+            </w:pPr>
+            <w:r/>
+            <w:r>
+              <w:rPr>
+                <w:rFonts w:ascii="Calibri" w:hAnsi="Calibri" w:eastAsia="Songti SC"/>
+                <w:b w:val="0"/>
+                <w:color w:val="111827"/>
+                <w:sz w:val="16"/>
+              </w:rPr>
+              <w:t>风险 2</w:t>
+            </w:r>
+          </w:p>
+        </w:tc>
+      </w:tr>
+      <w:tr>
+        <w:tc>
+          <w:tcPr>
+            <w:tcW w:type="dxa" w:w="3720"/>
+            <w:vAlign w:val="center"/>
+          </w:tcPr>
+          <w:p>
+            <w:pPr>
+              <w:spacing w:before="0" w:after="0"/>
+            </w:pPr>
+            <w:r/>
+            <w:r>
+              <w:rPr>
+                <w:rFonts w:ascii="Calibri" w:hAnsi="Calibri" w:eastAsia="Songti SC"/>
+                <w:b w:val="0"/>
+                <w:color w:val="111827"/>
+                <w:sz w:val="17"/>
+              </w:rPr>
+              <w:t>研究记录07 · 能源行业分析师压力测试报告</w:t>
+            </w:r>
+          </w:p>
+        </w:tc>
+        <w:tc>
+          <w:tcPr>
+            <w:tcW w:type="dxa" w:w="1560"/>
+            <w:vAlign w:val="center"/>
+          </w:tcPr>
+          <w:p>
+            <w:pPr>
+              <w:spacing w:before="0" w:after="0"/>
+            </w:pPr>
+            <w:r/>
+            <w:r>
+              <w:rPr>
+                <w:rFonts w:ascii="Calibri" w:hAnsi="Calibri" w:eastAsia="Songti SC"/>
+                <w:b w:val="0"/>
+                <w:color w:val="111827"/>
+                <w:sz w:val="16"/>
+              </w:rPr>
+              <w:t>未识别</w:t>
+            </w:r>
+          </w:p>
+        </w:tc>
+        <w:tc>
+          <w:tcPr>
+            <w:tcW w:type="dxa" w:w="1680"/>
+            <w:vAlign w:val="center"/>
+          </w:tcPr>
+          <w:p>
+            <w:pPr>
+              <w:spacing w:before="0" w:after="0"/>
+            </w:pPr>
+            <w:r/>
+            <w:r>
+              <w:rPr>
+                <w:rFonts w:ascii="Calibri" w:hAnsi="Calibri" w:eastAsia="Songti SC"/>
                 <w:b w:val="0"/>
                 <w:color w:val="111827"/>
                 <w:sz w:val="16"/>
@@ -1140,12 +2035,12 @@
             <w:r/>
             <w:r>
               <w:rPr>
-                <w:rFonts w:ascii="Calibri" w:hAnsi="Calibri" w:eastAsia="Heiti TC"/>
+                <w:rFonts w:ascii="Calibri" w:hAnsi="Calibri" w:eastAsia="Songti SC"/>
                 <w:b/>
                 <w:color w:val="111827"/>
                 <w:sz w:val="17"/>
               </w:rPr>
-              <w:t>37.3</w:t>
+              <w:t>49.4</w:t>
             </w:r>
           </w:p>
         </w:tc>
@@ -1162,12 +2057,1320 @@
             <w:r/>
             <w:r>
               <w:rPr>
-                <w:rFonts w:ascii="Calibri" w:hAnsi="Calibri" w:eastAsia="Heiti TC"/>
+                <w:rFonts w:ascii="Calibri" w:hAnsi="Calibri" w:eastAsia="Songti SC"/>
+                <w:b w:val="0"/>
+                <w:color w:val="111827"/>
+                <w:sz w:val="16"/>
+              </w:rPr>
+              <w:t>风险 3</w:t>
+            </w:r>
+          </w:p>
+        </w:tc>
+      </w:tr>
+      <w:tr>
+        <w:tc>
+          <w:tcPr>
+            <w:tcW w:type="dxa" w:w="3720"/>
+            <w:vAlign w:val="center"/>
+          </w:tcPr>
+          <w:p>
+            <w:pPr>
+              <w:spacing w:before="0" w:after="0"/>
+            </w:pPr>
+            <w:r/>
+            <w:r>
+              <w:rPr>
+                <w:rFonts w:ascii="Calibri" w:hAnsi="Calibri" w:eastAsia="Songti SC"/>
+                <w:b w:val="0"/>
+                <w:color w:val="111827"/>
+                <w:sz w:val="17"/>
+              </w:rPr>
+              <w:t>AI 产业追踪报告 (2026年6月5日)</w:t>
+            </w:r>
+          </w:p>
+        </w:tc>
+        <w:tc>
+          <w:tcPr>
+            <w:tcW w:type="dxa" w:w="1560"/>
+            <w:vAlign w:val="center"/>
+          </w:tcPr>
+          <w:p>
+            <w:pPr>
+              <w:spacing w:before="0" w:after="0"/>
+            </w:pPr>
+            <w:r/>
+            <w:r>
+              <w:rPr>
+                <w:rFonts w:ascii="Calibri" w:hAnsi="Calibri" w:eastAsia="Songti SC"/>
+                <w:b w:val="0"/>
+                <w:color w:val="111827"/>
+                <w:sz w:val="16"/>
+              </w:rPr>
+              <w:t>TMT行业分析师</w:t>
+            </w:r>
+          </w:p>
+        </w:tc>
+        <w:tc>
+          <w:tcPr>
+            <w:tcW w:type="dxa" w:w="1680"/>
+            <w:vAlign w:val="center"/>
+          </w:tcPr>
+          <w:p>
+            <w:pPr>
+              <w:spacing w:before="0" w:after="0"/>
+            </w:pPr>
+            <w:r/>
+            <w:r>
+              <w:rPr>
+                <w:rFonts w:ascii="Calibri" w:hAnsi="Calibri" w:eastAsia="Songti SC"/>
+                <w:b w:val="0"/>
+                <w:color w:val="111827"/>
+                <w:sz w:val="16"/>
+              </w:rPr>
+              <w:t>AI 基础设施</w:t>
+            </w:r>
+          </w:p>
+        </w:tc>
+        <w:tc>
+          <w:tcPr>
+            <w:tcW w:type="dxa" w:w="900"/>
+            <w:vAlign w:val="center"/>
+          </w:tcPr>
+          <w:p>
+            <w:pPr>
+              <w:spacing w:before="0" w:after="0"/>
+              <w:jc w:val="center"/>
+            </w:pPr>
+            <w:r/>
+            <w:r>
+              <w:rPr>
+                <w:rFonts w:ascii="Calibri" w:hAnsi="Calibri" w:eastAsia="Songti SC"/>
+                <w:b/>
+                <w:color w:val="111827"/>
+                <w:sz w:val="17"/>
+              </w:rPr>
+              <w:t>47.6</w:t>
+            </w:r>
+          </w:p>
+        </w:tc>
+        <w:tc>
+          <w:tcPr>
+            <w:tcW w:type="dxa" w:w="1500"/>
+            <w:vAlign w:val="center"/>
+          </w:tcPr>
+          <w:p>
+            <w:pPr>
+              <w:spacing w:before="0" w:after="0"/>
+              <w:jc w:val="center"/>
+            </w:pPr>
+            <w:r/>
+            <w:r>
+              <w:rPr>
+                <w:rFonts w:ascii="Calibri" w:hAnsi="Calibri" w:eastAsia="Songti SC"/>
                 <w:b w:val="0"/>
                 <w:color w:val="111827"/>
                 <w:sz w:val="16"/>
               </w:rPr>
               <w:t>常规</w:t>
+            </w:r>
+          </w:p>
+        </w:tc>
+      </w:tr>
+      <w:tr>
+        <w:tc>
+          <w:tcPr>
+            <w:tcW w:type="dxa" w:w="3720"/>
+            <w:vAlign w:val="center"/>
+          </w:tcPr>
+          <w:p>
+            <w:pPr>
+              <w:spacing w:before="0" w:after="0"/>
+            </w:pPr>
+            <w:r/>
+            <w:r>
+              <w:rPr>
+                <w:rFonts w:ascii="Calibri" w:hAnsi="Calibri" w:eastAsia="Songti SC"/>
+                <w:b w:val="0"/>
+                <w:color w:val="111827"/>
+                <w:sz w:val="17"/>
+              </w:rPr>
+              <w:t>USD/CNY 政策管理效能与资本流动压力的边界测试报告</w:t>
+            </w:r>
+          </w:p>
+        </w:tc>
+        <w:tc>
+          <w:tcPr>
+            <w:tcW w:type="dxa" w:w="1560"/>
+            <w:vAlign w:val="center"/>
+          </w:tcPr>
+          <w:p>
+            <w:pPr>
+              <w:spacing w:before="0" w:after="0"/>
+            </w:pPr>
+            <w:r/>
+            <w:r>
+              <w:rPr>
+                <w:rFonts w:ascii="Calibri" w:hAnsi="Calibri" w:eastAsia="Songti SC"/>
+                <w:b w:val="0"/>
+                <w:color w:val="111827"/>
+                <w:sz w:val="16"/>
+              </w:rPr>
+              <w:t>未识别</w:t>
+            </w:r>
+          </w:p>
+        </w:tc>
+        <w:tc>
+          <w:tcPr>
+            <w:tcW w:type="dxa" w:w="1680"/>
+            <w:vAlign w:val="center"/>
+          </w:tcPr>
+          <w:p>
+            <w:pPr>
+              <w:spacing w:before="0" w:after="0"/>
+            </w:pPr>
+            <w:r/>
+            <w:r>
+              <w:rPr>
+                <w:rFonts w:ascii="Calibri" w:hAnsi="Calibri" w:eastAsia="Songti SC"/>
+                <w:b w:val="0"/>
+                <w:color w:val="111827"/>
+                <w:sz w:val="16"/>
+              </w:rPr>
+              <w:t>宏观通胀传导</w:t>
+            </w:r>
+          </w:p>
+        </w:tc>
+        <w:tc>
+          <w:tcPr>
+            <w:tcW w:type="dxa" w:w="900"/>
+            <w:vAlign w:val="center"/>
+          </w:tcPr>
+          <w:p>
+            <w:pPr>
+              <w:spacing w:before="0" w:after="0"/>
+              <w:jc w:val="center"/>
+            </w:pPr>
+            <w:r/>
+            <w:r>
+              <w:rPr>
+                <w:rFonts w:ascii="Calibri" w:hAnsi="Calibri" w:eastAsia="Songti SC"/>
+                <w:b/>
+                <w:color w:val="111827"/>
+                <w:sz w:val="17"/>
+              </w:rPr>
+              <w:t>47.3</w:t>
+            </w:r>
+          </w:p>
+        </w:tc>
+        <w:tc>
+          <w:tcPr>
+            <w:tcW w:type="dxa" w:w="1500"/>
+            <w:vAlign w:val="center"/>
+          </w:tcPr>
+          <w:p>
+            <w:pPr>
+              <w:spacing w:before="0" w:after="0"/>
+              <w:jc w:val="center"/>
+            </w:pPr>
+            <w:r/>
+            <w:r>
+              <w:rPr>
+                <w:rFonts w:ascii="Calibri" w:hAnsi="Calibri" w:eastAsia="Songti SC"/>
+                <w:b w:val="0"/>
+                <w:color w:val="111827"/>
+                <w:sz w:val="16"/>
+              </w:rPr>
+              <w:t>风险 2</w:t>
+            </w:r>
+          </w:p>
+        </w:tc>
+      </w:tr>
+      <w:tr>
+        <w:tc>
+          <w:tcPr>
+            <w:tcW w:type="dxa" w:w="3720"/>
+            <w:vAlign w:val="center"/>
+          </w:tcPr>
+          <w:p>
+            <w:pPr>
+              <w:spacing w:before="0" w:after="0"/>
+            </w:pPr>
+            <w:r/>
+            <w:r>
+              <w:rPr>
+                <w:rFonts w:ascii="Calibri" w:hAnsi="Calibri" w:eastAsia="Songti SC"/>
+                <w:b w:val="0"/>
+                <w:color w:val="111827"/>
+                <w:sz w:val="17"/>
+              </w:rPr>
+              <w:t>结构性瓶颈、制造业回流与美联储长期终端利率</w:t>
+            </w:r>
+          </w:p>
+        </w:tc>
+        <w:tc>
+          <w:tcPr>
+            <w:tcW w:type="dxa" w:w="1560"/>
+            <w:vAlign w:val="center"/>
+          </w:tcPr>
+          <w:p>
+            <w:pPr>
+              <w:spacing w:before="0" w:after="0"/>
+            </w:pPr>
+            <w:r/>
+            <w:r>
+              <w:rPr>
+                <w:rFonts w:ascii="Calibri" w:hAnsi="Calibri" w:eastAsia="Songti SC"/>
+                <w:b w:val="0"/>
+                <w:color w:val="111827"/>
+                <w:sz w:val="16"/>
+              </w:rPr>
+              <w:t>未识别</w:t>
+            </w:r>
+          </w:p>
+        </w:tc>
+        <w:tc>
+          <w:tcPr>
+            <w:tcW w:type="dxa" w:w="1680"/>
+            <w:vAlign w:val="center"/>
+          </w:tcPr>
+          <w:p>
+            <w:pPr>
+              <w:spacing w:before="0" w:after="0"/>
+            </w:pPr>
+            <w:r/>
+            <w:r>
+              <w:rPr>
+                <w:rFonts w:ascii="Calibri" w:hAnsi="Calibri" w:eastAsia="Songti SC"/>
+                <w:b w:val="0"/>
+                <w:color w:val="111827"/>
+                <w:sz w:val="16"/>
+              </w:rPr>
+              <w:t>宏观通胀传导</w:t>
+            </w:r>
+          </w:p>
+        </w:tc>
+        <w:tc>
+          <w:tcPr>
+            <w:tcW w:type="dxa" w:w="900"/>
+            <w:vAlign w:val="center"/>
+          </w:tcPr>
+          <w:p>
+            <w:pPr>
+              <w:spacing w:before="0" w:after="0"/>
+              <w:jc w:val="center"/>
+            </w:pPr>
+            <w:r/>
+            <w:r>
+              <w:rPr>
+                <w:rFonts w:ascii="Calibri" w:hAnsi="Calibri" w:eastAsia="Songti SC"/>
+                <w:b/>
+                <w:color w:val="111827"/>
+                <w:sz w:val="17"/>
+              </w:rPr>
+              <w:t>47.2</w:t>
+            </w:r>
+          </w:p>
+        </w:tc>
+        <w:tc>
+          <w:tcPr>
+            <w:tcW w:type="dxa" w:w="1500"/>
+            <w:vAlign w:val="center"/>
+          </w:tcPr>
+          <w:p>
+            <w:pPr>
+              <w:spacing w:before="0" w:after="0"/>
+              <w:jc w:val="center"/>
+            </w:pPr>
+            <w:r/>
+            <w:r>
+              <w:rPr>
+                <w:rFonts w:ascii="Calibri" w:hAnsi="Calibri" w:eastAsia="Songti SC"/>
+                <w:b w:val="0"/>
+                <w:color w:val="111827"/>
+                <w:sz w:val="16"/>
+              </w:rPr>
+              <w:t>风险 1</w:t>
+            </w:r>
+          </w:p>
+        </w:tc>
+      </w:tr>
+      <w:tr>
+        <w:tc>
+          <w:tcPr>
+            <w:tcW w:type="dxa" w:w="3720"/>
+            <w:vAlign w:val="center"/>
+          </w:tcPr>
+          <w:p>
+            <w:pPr>
+              <w:spacing w:before="0" w:after="0"/>
+            </w:pPr>
+            <w:r/>
+            <w:r>
+              <w:rPr>
+                <w:rFonts w:ascii="Calibri" w:hAnsi="Calibri" w:eastAsia="Songti SC"/>
+                <w:b w:val="0"/>
+                <w:color w:val="111827"/>
+                <w:sz w:val="17"/>
+              </w:rPr>
+              <w:t>AI 数据中心电力与基础设施瓶颈评估</w:t>
+            </w:r>
+          </w:p>
+        </w:tc>
+        <w:tc>
+          <w:tcPr>
+            <w:tcW w:type="dxa" w:w="1560"/>
+            <w:vAlign w:val="center"/>
+          </w:tcPr>
+          <w:p>
+            <w:pPr>
+              <w:spacing w:before="0" w:after="0"/>
+            </w:pPr>
+            <w:r/>
+            <w:r>
+              <w:rPr>
+                <w:rFonts w:ascii="Calibri" w:hAnsi="Calibri" w:eastAsia="Songti SC"/>
+                <w:b w:val="0"/>
+                <w:color w:val="111827"/>
+                <w:sz w:val="16"/>
+              </w:rPr>
+              <w:t>未识别</w:t>
+            </w:r>
+          </w:p>
+        </w:tc>
+        <w:tc>
+          <w:tcPr>
+            <w:tcW w:type="dxa" w:w="1680"/>
+            <w:vAlign w:val="center"/>
+          </w:tcPr>
+          <w:p>
+            <w:pPr>
+              <w:spacing w:before="0" w:after="0"/>
+            </w:pPr>
+            <w:r/>
+            <w:r>
+              <w:rPr>
+                <w:rFonts w:ascii="Calibri" w:hAnsi="Calibri" w:eastAsia="Songti SC"/>
+                <w:b w:val="0"/>
+                <w:color w:val="111827"/>
+                <w:sz w:val="16"/>
+              </w:rPr>
+              <w:t>AI 基础设施</w:t>
+            </w:r>
+          </w:p>
+        </w:tc>
+        <w:tc>
+          <w:tcPr>
+            <w:tcW w:type="dxa" w:w="900"/>
+            <w:vAlign w:val="center"/>
+          </w:tcPr>
+          <w:p>
+            <w:pPr>
+              <w:spacing w:before="0" w:after="0"/>
+              <w:jc w:val="center"/>
+            </w:pPr>
+            <w:r/>
+            <w:r>
+              <w:rPr>
+                <w:rFonts w:ascii="Calibri" w:hAnsi="Calibri" w:eastAsia="Songti SC"/>
+                <w:b/>
+                <w:color w:val="111827"/>
+                <w:sz w:val="17"/>
+              </w:rPr>
+              <w:t>47.1</w:t>
+            </w:r>
+          </w:p>
+        </w:tc>
+        <w:tc>
+          <w:tcPr>
+            <w:tcW w:type="dxa" w:w="1500"/>
+            <w:vAlign w:val="center"/>
+          </w:tcPr>
+          <w:p>
+            <w:pPr>
+              <w:spacing w:before="0" w:after="0"/>
+              <w:jc w:val="center"/>
+            </w:pPr>
+            <w:r/>
+            <w:r>
+              <w:rPr>
+                <w:rFonts w:ascii="Calibri" w:hAnsi="Calibri" w:eastAsia="Songti SC"/>
+                <w:b w:val="0"/>
+                <w:color w:val="111827"/>
+                <w:sz w:val="16"/>
+              </w:rPr>
+              <w:t>风险 2</w:t>
+            </w:r>
+          </w:p>
+        </w:tc>
+      </w:tr>
+      <w:tr>
+        <w:tc>
+          <w:tcPr>
+            <w:tcW w:type="dxa" w:w="3720"/>
+            <w:vAlign w:val="center"/>
+          </w:tcPr>
+          <w:p>
+            <w:pPr>
+              <w:spacing w:before="0" w:after="0"/>
+            </w:pPr>
+            <w:r/>
+            <w:r>
+              <w:rPr>
+                <w:rFonts w:ascii="Calibri" w:hAnsi="Calibri" w:eastAsia="Songti SC"/>
+                <w:b w:val="0"/>
+                <w:color w:val="111827"/>
+                <w:sz w:val="17"/>
+              </w:rPr>
+              <w:t>研究记录03 · 能源行业分析师压力测试报告</w:t>
+            </w:r>
+          </w:p>
+        </w:tc>
+        <w:tc>
+          <w:tcPr>
+            <w:tcW w:type="dxa" w:w="1560"/>
+            <w:vAlign w:val="center"/>
+          </w:tcPr>
+          <w:p>
+            <w:pPr>
+              <w:spacing w:before="0" w:after="0"/>
+            </w:pPr>
+            <w:r/>
+            <w:r>
+              <w:rPr>
+                <w:rFonts w:ascii="Calibri" w:hAnsi="Calibri" w:eastAsia="Songti SC"/>
+                <w:b w:val="0"/>
+                <w:color w:val="111827"/>
+                <w:sz w:val="16"/>
+              </w:rPr>
+              <w:t>未识别</w:t>
+            </w:r>
+          </w:p>
+        </w:tc>
+        <w:tc>
+          <w:tcPr>
+            <w:tcW w:type="dxa" w:w="1680"/>
+            <w:vAlign w:val="center"/>
+          </w:tcPr>
+          <w:p>
+            <w:pPr>
+              <w:spacing w:before="0" w:after="0"/>
+            </w:pPr>
+            <w:r/>
+            <w:r>
+              <w:rPr>
+                <w:rFonts w:ascii="Calibri" w:hAnsi="Calibri" w:eastAsia="Songti SC"/>
+                <w:b w:val="0"/>
+                <w:color w:val="111827"/>
+                <w:sz w:val="16"/>
+              </w:rPr>
+              <w:t>宏观通胀传导</w:t>
+            </w:r>
+          </w:p>
+        </w:tc>
+        <w:tc>
+          <w:tcPr>
+            <w:tcW w:type="dxa" w:w="900"/>
+            <w:vAlign w:val="center"/>
+          </w:tcPr>
+          <w:p>
+            <w:pPr>
+              <w:spacing w:before="0" w:after="0"/>
+              <w:jc w:val="center"/>
+            </w:pPr>
+            <w:r/>
+            <w:r>
+              <w:rPr>
+                <w:rFonts w:ascii="Calibri" w:hAnsi="Calibri" w:eastAsia="Songti SC"/>
+                <w:b/>
+                <w:color w:val="111827"/>
+                <w:sz w:val="17"/>
+              </w:rPr>
+              <w:t>45.7</w:t>
+            </w:r>
+          </w:p>
+        </w:tc>
+        <w:tc>
+          <w:tcPr>
+            <w:tcW w:type="dxa" w:w="1500"/>
+            <w:vAlign w:val="center"/>
+          </w:tcPr>
+          <w:p>
+            <w:pPr>
+              <w:spacing w:before="0" w:after="0"/>
+              <w:jc w:val="center"/>
+            </w:pPr>
+            <w:r/>
+            <w:r>
+              <w:rPr>
+                <w:rFonts w:ascii="Calibri" w:hAnsi="Calibri" w:eastAsia="Songti SC"/>
+                <w:b w:val="0"/>
+                <w:color w:val="111827"/>
+                <w:sz w:val="16"/>
+              </w:rPr>
+              <w:t>风险 1</w:t>
+            </w:r>
+          </w:p>
+        </w:tc>
+      </w:tr>
+      <w:tr>
+        <w:tc>
+          <w:tcPr>
+            <w:tcW w:type="dxa" w:w="3720"/>
+            <w:vAlign w:val="center"/>
+          </w:tcPr>
+          <w:p>
+            <w:pPr>
+              <w:spacing w:before="0" w:after="0"/>
+            </w:pPr>
+            <w:r/>
+            <w:r>
+              <w:rPr>
+                <w:rFonts w:ascii="Calibri" w:hAnsi="Calibri" w:eastAsia="Songti SC"/>
+                <w:b w:val="0"/>
+                <w:color w:val="111827"/>
+                <w:sz w:val="17"/>
+              </w:rPr>
+              <w:t>2026-06-05 工业制造研究记录：压力测试电网设备厂商的"重定价溢价"——铜与电磁钢的成本飙升是否...</w:t>
+            </w:r>
+          </w:p>
+        </w:tc>
+        <w:tc>
+          <w:tcPr>
+            <w:tcW w:type="dxa" w:w="1560"/>
+            <w:vAlign w:val="center"/>
+          </w:tcPr>
+          <w:p>
+            <w:pPr>
+              <w:spacing w:before="0" w:after="0"/>
+            </w:pPr>
+            <w:r/>
+            <w:r>
+              <w:rPr>
+                <w:rFonts w:ascii="Calibri" w:hAnsi="Calibri" w:eastAsia="Songti SC"/>
+                <w:b w:val="0"/>
+                <w:color w:val="111827"/>
+                <w:sz w:val="16"/>
+              </w:rPr>
+              <w:t>未识别</w:t>
+            </w:r>
+          </w:p>
+        </w:tc>
+        <w:tc>
+          <w:tcPr>
+            <w:tcW w:type="dxa" w:w="1680"/>
+            <w:vAlign w:val="center"/>
+          </w:tcPr>
+          <w:p>
+            <w:pPr>
+              <w:spacing w:before="0" w:after="0"/>
+            </w:pPr>
+            <w:r/>
+            <w:r>
+              <w:rPr>
+                <w:rFonts w:ascii="Calibri" w:hAnsi="Calibri" w:eastAsia="Songti SC"/>
+                <w:b w:val="0"/>
+                <w:color w:val="111827"/>
+                <w:sz w:val="16"/>
+              </w:rPr>
+              <w:t>工业供给瓶颈</w:t>
+            </w:r>
+          </w:p>
+        </w:tc>
+        <w:tc>
+          <w:tcPr>
+            <w:tcW w:type="dxa" w:w="900"/>
+            <w:vAlign w:val="center"/>
+          </w:tcPr>
+          <w:p>
+            <w:pPr>
+              <w:spacing w:before="0" w:after="0"/>
+              <w:jc w:val="center"/>
+            </w:pPr>
+            <w:r/>
+            <w:r>
+              <w:rPr>
+                <w:rFonts w:ascii="Calibri" w:hAnsi="Calibri" w:eastAsia="Songti SC"/>
+                <w:b/>
+                <w:color w:val="111827"/>
+                <w:sz w:val="17"/>
+              </w:rPr>
+              <w:t>45.6</w:t>
+            </w:r>
+          </w:p>
+        </w:tc>
+        <w:tc>
+          <w:tcPr>
+            <w:tcW w:type="dxa" w:w="1500"/>
+            <w:vAlign w:val="center"/>
+          </w:tcPr>
+          <w:p>
+            <w:pPr>
+              <w:spacing w:before="0" w:after="0"/>
+              <w:jc w:val="center"/>
+            </w:pPr>
+            <w:r/>
+            <w:r>
+              <w:rPr>
+                <w:rFonts w:ascii="Calibri" w:hAnsi="Calibri" w:eastAsia="Songti SC"/>
+                <w:b w:val="0"/>
+                <w:color w:val="111827"/>
+                <w:sz w:val="16"/>
+              </w:rPr>
+              <w:t>风险 1</w:t>
+            </w:r>
+          </w:p>
+        </w:tc>
+      </w:tr>
+      <w:tr>
+        <w:tc>
+          <w:tcPr>
+            <w:tcW w:type="dxa" w:w="3720"/>
+            <w:vAlign w:val="center"/>
+          </w:tcPr>
+          <w:p>
+            <w:pPr>
+              <w:spacing w:before="0" w:after="0"/>
+            </w:pPr>
+            <w:r/>
+            <w:r>
+              <w:rPr>
+                <w:rFonts w:ascii="Calibri" w:hAnsi="Calibri" w:eastAsia="Songti SC"/>
+                <w:b w:val="0"/>
+                <w:color w:val="111827"/>
+                <w:sz w:val="17"/>
+              </w:rPr>
+              <w:t>2026-06-05 研究报告：AI 算力需求对电力基础设施与电网负荷的结构性推动</w:t>
+            </w:r>
+          </w:p>
+        </w:tc>
+        <w:tc>
+          <w:tcPr>
+            <w:tcW w:type="dxa" w:w="1560"/>
+            <w:vAlign w:val="center"/>
+          </w:tcPr>
+          <w:p>
+            <w:pPr>
+              <w:spacing w:before="0" w:after="0"/>
+            </w:pPr>
+            <w:r/>
+            <w:r>
+              <w:rPr>
+                <w:rFonts w:ascii="Calibri" w:hAnsi="Calibri" w:eastAsia="Songti SC"/>
+                <w:b w:val="0"/>
+                <w:color w:val="111827"/>
+                <w:sz w:val="16"/>
+              </w:rPr>
+              <w:t>未识别</w:t>
+            </w:r>
+          </w:p>
+        </w:tc>
+        <w:tc>
+          <w:tcPr>
+            <w:tcW w:type="dxa" w:w="1680"/>
+            <w:vAlign w:val="center"/>
+          </w:tcPr>
+          <w:p>
+            <w:pPr>
+              <w:spacing w:before="0" w:after="0"/>
+            </w:pPr>
+            <w:r/>
+            <w:r>
+              <w:rPr>
+                <w:rFonts w:ascii="Calibri" w:hAnsi="Calibri" w:eastAsia="Songti SC"/>
+                <w:b w:val="0"/>
+                <w:color w:val="111827"/>
+                <w:sz w:val="16"/>
+              </w:rPr>
+              <w:t>AI 基础设施</w:t>
+            </w:r>
+          </w:p>
+        </w:tc>
+        <w:tc>
+          <w:tcPr>
+            <w:tcW w:type="dxa" w:w="900"/>
+            <w:vAlign w:val="center"/>
+          </w:tcPr>
+          <w:p>
+            <w:pPr>
+              <w:spacing w:before="0" w:after="0"/>
+              <w:jc w:val="center"/>
+            </w:pPr>
+            <w:r/>
+            <w:r>
+              <w:rPr>
+                <w:rFonts w:ascii="Calibri" w:hAnsi="Calibri" w:eastAsia="Songti SC"/>
+                <w:b/>
+                <w:color w:val="111827"/>
+                <w:sz w:val="17"/>
+              </w:rPr>
+              <w:t>44.9</w:t>
+            </w:r>
+          </w:p>
+        </w:tc>
+        <w:tc>
+          <w:tcPr>
+            <w:tcW w:type="dxa" w:w="1500"/>
+            <w:vAlign w:val="center"/>
+          </w:tcPr>
+          <w:p>
+            <w:pPr>
+              <w:spacing w:before="0" w:after="0"/>
+              <w:jc w:val="center"/>
+            </w:pPr>
+            <w:r/>
+            <w:r>
+              <w:rPr>
+                <w:rFonts w:ascii="Calibri" w:hAnsi="Calibri" w:eastAsia="Songti SC"/>
+                <w:b w:val="0"/>
+                <w:color w:val="111827"/>
+                <w:sz w:val="16"/>
+              </w:rPr>
+              <w:t>风险 1</w:t>
+            </w:r>
+          </w:p>
+        </w:tc>
+      </w:tr>
+      <w:tr>
+        <w:tc>
+          <w:tcPr>
+            <w:tcW w:type="dxa" w:w="3720"/>
+            <w:vAlign w:val="center"/>
+          </w:tcPr>
+          <w:p>
+            <w:pPr>
+              <w:spacing w:before="0" w:after="0"/>
+            </w:pPr>
+            <w:r/>
+            <w:r>
+              <w:rPr>
+                <w:rFonts w:ascii="Calibri" w:hAnsi="Calibri" w:eastAsia="Songti SC"/>
+                <w:b w:val="0"/>
+                <w:color w:val="111827"/>
+                <w:sz w:val="17"/>
+              </w:rPr>
+              <w:t>边缘AI与国产安全芯片规模化量产能否匹配住宅VPP放量？——产能与瓶颈压力测试</w:t>
+            </w:r>
+          </w:p>
+        </w:tc>
+        <w:tc>
+          <w:tcPr>
+            <w:tcW w:type="dxa" w:w="1560"/>
+            <w:vAlign w:val="center"/>
+          </w:tcPr>
+          <w:p>
+            <w:pPr>
+              <w:spacing w:before="0" w:after="0"/>
+            </w:pPr>
+            <w:r/>
+            <w:r>
+              <w:rPr>
+                <w:rFonts w:ascii="Calibri" w:hAnsi="Calibri" w:eastAsia="Songti SC"/>
+                <w:b w:val="0"/>
+                <w:color w:val="111827"/>
+                <w:sz w:val="16"/>
+              </w:rPr>
+              <w:t>未识别</w:t>
+            </w:r>
+          </w:p>
+        </w:tc>
+        <w:tc>
+          <w:tcPr>
+            <w:tcW w:type="dxa" w:w="1680"/>
+            <w:vAlign w:val="center"/>
+          </w:tcPr>
+          <w:p>
+            <w:pPr>
+              <w:spacing w:before="0" w:after="0"/>
+            </w:pPr>
+            <w:r/>
+            <w:r>
+              <w:rPr>
+                <w:rFonts w:ascii="Calibri" w:hAnsi="Calibri" w:eastAsia="Songti SC"/>
+                <w:b w:val="0"/>
+                <w:color w:val="111827"/>
+                <w:sz w:val="16"/>
+              </w:rPr>
+              <w:t>宏观通胀传导</w:t>
+            </w:r>
+          </w:p>
+        </w:tc>
+        <w:tc>
+          <w:tcPr>
+            <w:tcW w:type="dxa" w:w="900"/>
+            <w:vAlign w:val="center"/>
+          </w:tcPr>
+          <w:p>
+            <w:pPr>
+              <w:spacing w:before="0" w:after="0"/>
+              <w:jc w:val="center"/>
+            </w:pPr>
+            <w:r/>
+            <w:r>
+              <w:rPr>
+                <w:rFonts w:ascii="Calibri" w:hAnsi="Calibri" w:eastAsia="Songti SC"/>
+                <w:b/>
+                <w:color w:val="111827"/>
+                <w:sz w:val="17"/>
+              </w:rPr>
+              <w:t>44.6</w:t>
+            </w:r>
+          </w:p>
+        </w:tc>
+        <w:tc>
+          <w:tcPr>
+            <w:tcW w:type="dxa" w:w="1500"/>
+            <w:vAlign w:val="center"/>
+          </w:tcPr>
+          <w:p>
+            <w:pPr>
+              <w:spacing w:before="0" w:after="0"/>
+              <w:jc w:val="center"/>
+            </w:pPr>
+            <w:r/>
+            <w:r>
+              <w:rPr>
+                <w:rFonts w:ascii="Calibri" w:hAnsi="Calibri" w:eastAsia="Songti SC"/>
+                <w:b w:val="0"/>
+                <w:color w:val="111827"/>
+                <w:sz w:val="16"/>
+              </w:rPr>
+              <w:t>风险 3</w:t>
+            </w:r>
+          </w:p>
+        </w:tc>
+      </w:tr>
+      <w:tr>
+        <w:tc>
+          <w:tcPr>
+            <w:tcW w:type="dxa" w:w="3720"/>
+            <w:vAlign w:val="center"/>
+          </w:tcPr>
+          <w:p>
+            <w:pPr>
+              <w:spacing w:before="0" w:after="0"/>
+            </w:pPr>
+            <w:r/>
+            <w:r>
+              <w:rPr>
+                <w:rFonts w:ascii="Calibri" w:hAnsi="Calibri" w:eastAsia="Songti SC"/>
+                <w:b w:val="0"/>
+                <w:color w:val="111827"/>
+                <w:sz w:val="17"/>
+              </w:rPr>
+              <w:t>AI 算力需求下的绿电政策约束与运营商配套压力评估</w:t>
+            </w:r>
+          </w:p>
+        </w:tc>
+        <w:tc>
+          <w:tcPr>
+            <w:tcW w:type="dxa" w:w="1560"/>
+            <w:vAlign w:val="center"/>
+          </w:tcPr>
+          <w:p>
+            <w:pPr>
+              <w:spacing w:before="0" w:after="0"/>
+            </w:pPr>
+            <w:r/>
+            <w:r>
+              <w:rPr>
+                <w:rFonts w:ascii="Calibri" w:hAnsi="Calibri" w:eastAsia="Songti SC"/>
+                <w:b w:val="0"/>
+                <w:color w:val="111827"/>
+                <w:sz w:val="16"/>
+              </w:rPr>
+              <w:t>未识别</w:t>
+            </w:r>
+          </w:p>
+        </w:tc>
+        <w:tc>
+          <w:tcPr>
+            <w:tcW w:type="dxa" w:w="1680"/>
+            <w:vAlign w:val="center"/>
+          </w:tcPr>
+          <w:p>
+            <w:pPr>
+              <w:spacing w:before="0" w:after="0"/>
+            </w:pPr>
+            <w:r/>
+            <w:r>
+              <w:rPr>
+                <w:rFonts w:ascii="Calibri" w:hAnsi="Calibri" w:eastAsia="Songti SC"/>
+                <w:b w:val="0"/>
+                <w:color w:val="111827"/>
+                <w:sz w:val="16"/>
+              </w:rPr>
+              <w:t>AI 基础设施</w:t>
+            </w:r>
+          </w:p>
+        </w:tc>
+        <w:tc>
+          <w:tcPr>
+            <w:tcW w:type="dxa" w:w="900"/>
+            <w:vAlign w:val="center"/>
+          </w:tcPr>
+          <w:p>
+            <w:pPr>
+              <w:spacing w:before="0" w:after="0"/>
+              <w:jc w:val="center"/>
+            </w:pPr>
+            <w:r/>
+            <w:r>
+              <w:rPr>
+                <w:rFonts w:ascii="Calibri" w:hAnsi="Calibri" w:eastAsia="Songti SC"/>
+                <w:b/>
+                <w:color w:val="111827"/>
+                <w:sz w:val="17"/>
+              </w:rPr>
+              <w:t>44.5</w:t>
+            </w:r>
+          </w:p>
+        </w:tc>
+        <w:tc>
+          <w:tcPr>
+            <w:tcW w:type="dxa" w:w="1500"/>
+            <w:vAlign w:val="center"/>
+          </w:tcPr>
+          <w:p>
+            <w:pPr>
+              <w:spacing w:before="0" w:after="0"/>
+              <w:jc w:val="center"/>
+            </w:pPr>
+            <w:r/>
+            <w:r>
+              <w:rPr>
+                <w:rFonts w:ascii="Calibri" w:hAnsi="Calibri" w:eastAsia="Songti SC"/>
+                <w:b w:val="0"/>
+                <w:color w:val="111827"/>
+                <w:sz w:val="16"/>
+              </w:rPr>
+              <w:t>风险 3</w:t>
+            </w:r>
+          </w:p>
+        </w:tc>
+      </w:tr>
+      <w:tr>
+        <w:tc>
+          <w:tcPr>
+            <w:tcW w:type="dxa" w:w="3720"/>
+            <w:vAlign w:val="center"/>
+          </w:tcPr>
+          <w:p>
+            <w:pPr>
+              <w:spacing w:before="0" w:after="0"/>
+            </w:pPr>
+            <w:r/>
+            <w:r>
+              <w:rPr>
+                <w:rFonts w:ascii="Calibri" w:hAnsi="Calibri" w:eastAsia="Songti SC"/>
+                <w:b w:val="0"/>
+                <w:color w:val="111827"/>
+                <w:sz w:val="17"/>
+              </w:rPr>
+              <w:t>行业定位</w:t>
+            </w:r>
+          </w:p>
+        </w:tc>
+        <w:tc>
+          <w:tcPr>
+            <w:tcW w:type="dxa" w:w="1560"/>
+            <w:vAlign w:val="center"/>
+          </w:tcPr>
+          <w:p>
+            <w:pPr>
+              <w:spacing w:before="0" w:after="0"/>
+            </w:pPr>
+            <w:r/>
+            <w:r>
+              <w:rPr>
+                <w:rFonts w:ascii="Calibri" w:hAnsi="Calibri" w:eastAsia="Songti SC"/>
+                <w:b w:val="0"/>
+                <w:color w:val="111827"/>
+                <w:sz w:val="16"/>
+              </w:rPr>
+              <w:t>深研主编</w:t>
+            </w:r>
+          </w:p>
+        </w:tc>
+        <w:tc>
+          <w:tcPr>
+            <w:tcW w:type="dxa" w:w="1680"/>
+            <w:vAlign w:val="center"/>
+          </w:tcPr>
+          <w:p>
+            <w:pPr>
+              <w:spacing w:before="0" w:after="0"/>
+            </w:pPr>
+            <w:r/>
+            <w:r>
+              <w:rPr>
+                <w:rFonts w:ascii="Calibri" w:hAnsi="Calibri" w:eastAsia="Songti SC"/>
+                <w:b w:val="0"/>
+                <w:color w:val="111827"/>
+                <w:sz w:val="16"/>
+              </w:rPr>
+              <w:t>宏观通胀传导</w:t>
+            </w:r>
+          </w:p>
+        </w:tc>
+        <w:tc>
+          <w:tcPr>
+            <w:tcW w:type="dxa" w:w="900"/>
+            <w:vAlign w:val="center"/>
+          </w:tcPr>
+          <w:p>
+            <w:pPr>
+              <w:spacing w:before="0" w:after="0"/>
+              <w:jc w:val="center"/>
+            </w:pPr>
+            <w:r/>
+            <w:r>
+              <w:rPr>
+                <w:rFonts w:ascii="Calibri" w:hAnsi="Calibri" w:eastAsia="Songti SC"/>
+                <w:b/>
+                <w:color w:val="111827"/>
+                <w:sz w:val="17"/>
+              </w:rPr>
+              <w:t>44.2</w:t>
+            </w:r>
+          </w:p>
+        </w:tc>
+        <w:tc>
+          <w:tcPr>
+            <w:tcW w:type="dxa" w:w="1500"/>
+            <w:vAlign w:val="center"/>
+          </w:tcPr>
+          <w:p>
+            <w:pPr>
+              <w:spacing w:before="0" w:after="0"/>
+              <w:jc w:val="center"/>
+            </w:pPr>
+            <w:r/>
+            <w:r>
+              <w:rPr>
+                <w:rFonts w:ascii="Calibri" w:hAnsi="Calibri" w:eastAsia="Songti SC"/>
+                <w:b w:val="0"/>
+                <w:color w:val="111827"/>
+                <w:sz w:val="16"/>
+              </w:rPr>
+              <w:t>常规</w:t>
+            </w:r>
+          </w:p>
+        </w:tc>
+      </w:tr>
+      <w:tr>
+        <w:tc>
+          <w:tcPr>
+            <w:tcW w:type="dxa" w:w="3720"/>
+            <w:vAlign w:val="center"/>
+          </w:tcPr>
+          <w:p>
+            <w:pPr>
+              <w:spacing w:before="0" w:after="0"/>
+            </w:pPr>
+            <w:r/>
+            <w:r>
+              <w:rPr>
+                <w:rFonts w:ascii="Calibri" w:hAnsi="Calibri" w:eastAsia="Songti SC"/>
+                <w:b w:val="0"/>
+                <w:color w:val="111827"/>
+                <w:sz w:val="17"/>
+              </w:rPr>
+              <w:t>盈利预测</w:t>
+            </w:r>
+          </w:p>
+        </w:tc>
+        <w:tc>
+          <w:tcPr>
+            <w:tcW w:type="dxa" w:w="1560"/>
+            <w:vAlign w:val="center"/>
+          </w:tcPr>
+          <w:p>
+            <w:pPr>
+              <w:spacing w:before="0" w:after="0"/>
+            </w:pPr>
+            <w:r/>
+            <w:r>
+              <w:rPr>
+                <w:rFonts w:ascii="Calibri" w:hAnsi="Calibri" w:eastAsia="Songti SC"/>
+                <w:b w:val="0"/>
+                <w:color w:val="111827"/>
+                <w:sz w:val="16"/>
+              </w:rPr>
+              <w:t>深研主编</w:t>
+            </w:r>
+          </w:p>
+        </w:tc>
+        <w:tc>
+          <w:tcPr>
+            <w:tcW w:type="dxa" w:w="1680"/>
+            <w:vAlign w:val="center"/>
+          </w:tcPr>
+          <w:p>
+            <w:pPr>
+              <w:spacing w:before="0" w:after="0"/>
+            </w:pPr>
+            <w:r/>
+            <w:r>
+              <w:rPr>
+                <w:rFonts w:ascii="Calibri" w:hAnsi="Calibri" w:eastAsia="Songti SC"/>
+                <w:b w:val="0"/>
+                <w:color w:val="111827"/>
+                <w:sz w:val="16"/>
+              </w:rPr>
+              <w:t>AI 基础设施</w:t>
+            </w:r>
+          </w:p>
+        </w:tc>
+        <w:tc>
+          <w:tcPr>
+            <w:tcW w:type="dxa" w:w="900"/>
+            <w:vAlign w:val="center"/>
+          </w:tcPr>
+          <w:p>
+            <w:pPr>
+              <w:spacing w:before="0" w:after="0"/>
+              <w:jc w:val="center"/>
+            </w:pPr>
+            <w:r/>
+            <w:r>
+              <w:rPr>
+                <w:rFonts w:ascii="Calibri" w:hAnsi="Calibri" w:eastAsia="Songti SC"/>
+                <w:b/>
+                <w:color w:val="111827"/>
+                <w:sz w:val="17"/>
+              </w:rPr>
+              <w:t>43.7</w:t>
+            </w:r>
+          </w:p>
+        </w:tc>
+        <w:tc>
+          <w:tcPr>
+            <w:tcW w:type="dxa" w:w="1500"/>
+            <w:vAlign w:val="center"/>
+          </w:tcPr>
+          <w:p>
+            <w:pPr>
+              <w:spacing w:before="0" w:after="0"/>
+              <w:jc w:val="center"/>
+            </w:pPr>
+            <w:r/>
+            <w:r>
+              <w:rPr>
+                <w:rFonts w:ascii="Calibri" w:hAnsi="Calibri" w:eastAsia="Songti SC"/>
+                <w:b w:val="0"/>
+                <w:color w:val="111827"/>
+                <w:sz w:val="16"/>
+              </w:rPr>
+              <w:t>风险 1</w:t>
+            </w:r>
+          </w:p>
+        </w:tc>
+      </w:tr>
+      <w:tr>
+        <w:tc>
+          <w:tcPr>
+            <w:tcW w:type="dxa" w:w="3720"/>
+            <w:vAlign w:val="center"/>
+          </w:tcPr>
+          <w:p>
+            <w:pPr>
+              <w:spacing w:before="0" w:after="0"/>
+            </w:pPr>
+            <w:r/>
+            <w:r>
+              <w:rPr>
+                <w:rFonts w:ascii="Calibri" w:hAnsi="Calibri" w:eastAsia="Songti SC"/>
+                <w:b w:val="0"/>
+                <w:color w:val="111827"/>
+                <w:sz w:val="17"/>
+              </w:rPr>
+              <w:t>智能家居背后的 AI 与 IoT 硬件供应链：传感器、AI 芯片及智能模组的增长潜力</w:t>
+            </w:r>
+          </w:p>
+        </w:tc>
+        <w:tc>
+          <w:tcPr>
+            <w:tcW w:type="dxa" w:w="1560"/>
+            <w:vAlign w:val="center"/>
+          </w:tcPr>
+          <w:p>
+            <w:pPr>
+              <w:spacing w:before="0" w:after="0"/>
+            </w:pPr>
+            <w:r/>
+            <w:r>
+              <w:rPr>
+                <w:rFonts w:ascii="Calibri" w:hAnsi="Calibri" w:eastAsia="Songti SC"/>
+                <w:b w:val="0"/>
+                <w:color w:val="111827"/>
+                <w:sz w:val="16"/>
+              </w:rPr>
+              <w:t>未识别</w:t>
+            </w:r>
+          </w:p>
+        </w:tc>
+        <w:tc>
+          <w:tcPr>
+            <w:tcW w:type="dxa" w:w="1680"/>
+            <w:vAlign w:val="center"/>
+          </w:tcPr>
+          <w:p>
+            <w:pPr>
+              <w:spacing w:before="0" w:after="0"/>
+            </w:pPr>
+            <w:r/>
+            <w:r>
+              <w:rPr>
+                <w:rFonts w:ascii="Calibri" w:hAnsi="Calibri" w:eastAsia="Songti SC"/>
+                <w:b w:val="0"/>
+                <w:color w:val="111827"/>
+                <w:sz w:val="16"/>
+              </w:rPr>
+              <w:t>AI 基础设施</w:t>
+            </w:r>
+          </w:p>
+        </w:tc>
+        <w:tc>
+          <w:tcPr>
+            <w:tcW w:type="dxa" w:w="900"/>
+            <w:vAlign w:val="center"/>
+          </w:tcPr>
+          <w:p>
+            <w:pPr>
+              <w:spacing w:before="0" w:after="0"/>
+              <w:jc w:val="center"/>
+            </w:pPr>
+            <w:r/>
+            <w:r>
+              <w:rPr>
+                <w:rFonts w:ascii="Calibri" w:hAnsi="Calibri" w:eastAsia="Songti SC"/>
+                <w:b/>
+                <w:color w:val="111827"/>
+                <w:sz w:val="17"/>
+              </w:rPr>
+              <w:t>43.4</w:t>
+            </w:r>
+          </w:p>
+        </w:tc>
+        <w:tc>
+          <w:tcPr>
+            <w:tcW w:type="dxa" w:w="1500"/>
+            <w:vAlign w:val="center"/>
+          </w:tcPr>
+          <w:p>
+            <w:pPr>
+              <w:spacing w:before="0" w:after="0"/>
+              <w:jc w:val="center"/>
+            </w:pPr>
+            <w:r/>
+            <w:r>
+              <w:rPr>
+                <w:rFonts w:ascii="Calibri" w:hAnsi="Calibri" w:eastAsia="Songti SC"/>
+                <w:b w:val="0"/>
+                <w:color w:val="111827"/>
+                <w:sz w:val="16"/>
+              </w:rPr>
+              <w:t>风险 1</w:t>
             </w:r>
           </w:p>
         </w:tc>
@@ -1179,7 +3382,7 @@
       </w:pPr>
       <w:r>
         <w:rPr>
-          <w:rFonts w:ascii="Calibri" w:hAnsi="Calibri" w:eastAsia="Heiti TC"/>
+          <w:rFonts w:ascii="Calibri" w:hAnsi="Calibri" w:eastAsia="Songti SC"/>
           <w:b w:val="0"/>
           <w:i/>
           <w:color w:val="667085"/>
@@ -1209,7 +3412,7 @@
     </w:pPr>
     <w:r>
       <w:rPr>
-        <w:rFonts w:ascii="Calibri" w:hAnsi="Calibri" w:eastAsia="Heiti TC"/>
+        <w:rFonts w:ascii="Calibri" w:hAnsi="Calibri" w:eastAsia="Songti SC"/>
         <w:color w:val="667085"/>
         <w:sz w:val="17"/>
       </w:rPr>
@@ -1228,7 +3431,7 @@
     <w:r/>
     <w:r>
       <w:rPr>
-        <w:rFonts w:ascii="Calibri" w:hAnsi="Calibri" w:eastAsia="Heiti TC"/>
+        <w:rFonts w:ascii="Calibri" w:hAnsi="Calibri" w:eastAsia="Songti SC"/>
         <w:color w:val="667085"/>
         <w:sz w:val="18"/>
       </w:rPr>
@@ -1605,7 +3808,7 @@
       <w:spacing w:after="120" w:line="264" w:lineRule="auto"/>
     </w:pPr>
     <w:rPr>
-      <w:rFonts w:ascii="Calibri" w:hAnsi="Calibri" w:eastAsia="Heiti TC"/>
+      <w:rFonts w:ascii="Calibri" w:hAnsi="Calibri" w:eastAsia="Songti SC"/>
       <w:b w:val="0"/>
       <w:color w:val="111827"/>
       <w:sz w:val="22"/>
@@ -1670,7 +3873,7 @@
       <w:outlineLvl w:val="0"/>
     </w:pPr>
     <w:rPr>
-      <w:rFonts w:asciiTheme="majorHAnsi" w:eastAsiaTheme="majorEastAsia" w:hAnsiTheme="majorHAnsi" w:cstheme="majorBidi" w:ascii="Calibri" w:hAnsi="Calibri" w:eastAsia="Heiti TC"/>
+      <w:rFonts w:asciiTheme="majorHAnsi" w:eastAsiaTheme="majorEastAsia" w:hAnsiTheme="majorHAnsi" w:cstheme="majorBidi" w:ascii="Calibri" w:hAnsi="Calibri" w:eastAsia="Songti SC"/>
       <w:b/>
       <w:bCs/>
       <w:color w:val="2E74B5"/>
@@ -1694,7 +3897,7 @@
       <w:outlineLvl w:val="1"/>
     </w:pPr>
     <w:rPr>
-      <w:rFonts w:asciiTheme="majorHAnsi" w:eastAsiaTheme="majorEastAsia" w:hAnsiTheme="majorHAnsi" w:cstheme="majorBidi" w:ascii="Calibri" w:hAnsi="Calibri" w:eastAsia="Heiti TC"/>
+      <w:rFonts w:asciiTheme="majorHAnsi" w:eastAsiaTheme="majorEastAsia" w:hAnsiTheme="majorHAnsi" w:cstheme="majorBidi" w:ascii="Calibri" w:hAnsi="Calibri" w:eastAsia="Songti SC"/>
       <w:b/>
       <w:bCs/>
       <w:color w:val="2E74B5"/>
@@ -1718,7 +3921,7 @@
       <w:outlineLvl w:val="2"/>
     </w:pPr>
     <w:rPr>
-      <w:rFonts w:asciiTheme="majorHAnsi" w:eastAsiaTheme="majorEastAsia" w:hAnsiTheme="majorHAnsi" w:cstheme="majorBidi" w:ascii="Calibri" w:hAnsi="Calibri" w:eastAsia="Heiti TC"/>
+      <w:rFonts w:asciiTheme="majorHAnsi" w:eastAsiaTheme="majorEastAsia" w:hAnsiTheme="majorHAnsi" w:cstheme="majorBidi" w:ascii="Calibri" w:hAnsi="Calibri" w:eastAsia="Songti SC"/>
       <w:b/>
       <w:bCs/>
       <w:color w:val="1F4D78"/>
@@ -1960,7 +4163,7 @@
       <w:contextualSpacing/>
     </w:pPr>
     <w:rPr>
-      <w:rFonts w:asciiTheme="majorHAnsi" w:eastAsiaTheme="majorEastAsia" w:hAnsiTheme="majorHAnsi" w:cstheme="majorBidi" w:ascii="Calibri" w:hAnsi="Calibri" w:eastAsia="Heiti TC"/>
+      <w:rFonts w:asciiTheme="majorHAnsi" w:eastAsiaTheme="majorEastAsia" w:hAnsiTheme="majorHAnsi" w:cstheme="majorBidi" w:ascii="Calibri" w:hAnsi="Calibri" w:eastAsia="Songti SC"/>
       <w:b/>
       <w:color w:val="0B2545"/>
       <w:spacing w:val="5"/>
@@ -1998,7 +4201,7 @@
       </w:numPr>
     </w:pPr>
     <w:rPr>
-      <w:rFonts w:asciiTheme="majorHAnsi" w:eastAsiaTheme="majorEastAsia" w:hAnsiTheme="majorHAnsi" w:cstheme="majorBidi" w:ascii="Calibri" w:hAnsi="Calibri" w:eastAsia="Heiti TC"/>
+      <w:rFonts w:asciiTheme="majorHAnsi" w:eastAsiaTheme="majorEastAsia" w:hAnsiTheme="majorHAnsi" w:cstheme="majorBidi" w:ascii="Calibri" w:hAnsi="Calibri" w:eastAsia="Songti SC"/>
       <w:b w:val="0"/>
       <w:i/>
       <w:iCs/>

</xml_diff>